<commit_message>
Ajout d'explication aux paroles du chant pour la Blason de l'Aigle
</commit_message>
<xml_diff>
--- a/assets/Terre-de-Barons-TB7-Eagle-Crest-Lyrics.docx
+++ b/assets/Terre-de-Barons-TB7-Eagle-Crest-Lyrics.docx
@@ -14,103 +14,58 @@
           <w:rFonts w:ascii="Segoe UI Emoji" w:hAnsi="Segoe UI Emoji" w:cs="Segoe UI Emoji"/>
           <w:noProof/>
         </w:rPr>
-        <w:t>✒️</w:t>
+        <w:t>📜</w:t>
       </w:r>
       <w:r>
         <w:rPr>
           <w:noProof/>
         </w:rPr>
-        <w:t xml:space="preserve"> Introduction</w:t>
+        <w:t xml:space="preserve"> </w:t>
       </w:r>
       <w:r>
         <w:rPr>
           <w:noProof/>
         </w:rPr>
+        <w:t>Sota</w:t>
+      </w:r>
+      <w:r>
+        <w:rPr>
+          <w:noProof/>
+        </w:rPr>
         <w:t xml:space="preserve"> </w:t>
       </w:r>
       <w:r>
         <w:rPr>
           <w:noProof/>
         </w:rPr>
-        <w:t xml:space="preserve">sur </w:t>
+        <w:t>la</w:t>
       </w:r>
       <w:r>
         <w:rPr>
           <w:noProof/>
         </w:rPr>
-        <w:t>xxx</w:t>
+        <w:t xml:space="preserve"> </w:t>
+      </w:r>
+      <w:r>
+        <w:rPr>
+          <w:noProof/>
+        </w:rPr>
+        <w:t>crotz</w:t>
+      </w:r>
+      <w:r>
+        <w:rPr>
+          <w:noProof/>
+        </w:rPr>
+        <w:t>– Lyrics &amp; Translations</w:t>
       </w:r>
     </w:p>
     <w:p>
       <w:pPr>
-        <w:pStyle w:val="Titre1"/>
-        <w:rPr>
-          <w:noProof/>
-        </w:rPr>
-      </w:pPr>
-      <w:r>
-        <w:rPr>
-          <w:rFonts w:ascii="Segoe UI Emoji" w:hAnsi="Segoe UI Emoji" w:cs="Segoe UI Emoji"/>
-          <w:noProof/>
-        </w:rPr>
-        <w:t>📜</w:t>
-      </w:r>
-      <w:r>
-        <w:rPr>
-          <w:noProof/>
-        </w:rPr>
-        <w:t xml:space="preserve"> </w:t>
-      </w:r>
-      <w:r>
-        <w:rPr>
-          <w:noProof/>
-        </w:rPr>
-        <w:t>Sota</w:t>
-      </w:r>
-      <w:r>
-        <w:rPr>
-          <w:noProof/>
-        </w:rPr>
-        <w:t xml:space="preserve"> </w:t>
-      </w:r>
-      <w:r>
-        <w:rPr>
-          <w:noProof/>
-        </w:rPr>
-        <w:t>la</w:t>
-      </w:r>
-      <w:r>
-        <w:rPr>
-          <w:noProof/>
-        </w:rPr>
-        <w:t xml:space="preserve"> </w:t>
-      </w:r>
-      <w:r>
-        <w:rPr>
-          <w:noProof/>
-        </w:rPr>
-        <w:t>crotz</w:t>
-      </w:r>
-      <w:r>
-        <w:rPr>
-          <w:noProof/>
-        </w:rPr>
-        <w:t>– Lyrics &amp; Translations</w:t>
-      </w:r>
-    </w:p>
-    <w:p>
-      <w:pPr>
         <w:pStyle w:val="Titre2"/>
         <w:ind w:left="720"/>
       </w:pPr>
       <w:r>
-        <w:t xml:space="preserve">Couplet </w:t>
-      </w:r>
-      <w:r>
-        <w:t>1 :</w:t>
-      </w:r>
-      <w:r>
-        <w:t xml:space="preserve"> Solo Baryton</w:t>
+        <w:t>Couplet 1 : Solo Baryton</w:t>
       </w:r>
       <w:r>
         <w:t xml:space="preserve"> </w:t>
@@ -462,10 +417,7 @@
         <w:t xml:space="preserve"> 1</w:t>
       </w:r>
       <w:r>
-        <w:t xml:space="preserve"> :</w:t>
-      </w:r>
-      <w:r>
-        <w:t xml:space="preserve"> Chœur &amp; Sacqueboutes</w:t>
+        <w:t xml:space="preserve"> : Chœur &amp; Sacqueboutes</w:t>
       </w:r>
       <w:r>
         <w:t xml:space="preserve"> </w:t>
@@ -479,6 +431,7 @@
         </w:rPr>
         <w:t xml:space="preserve">Chorus </w:t>
       </w:r>
+      <w:proofErr w:type="gramStart"/>
       <w:r>
         <w:rPr>
           <w:lang w:val="en-US"/>
@@ -491,6 +444,7 @@
         </w:rPr>
         <w:t>:</w:t>
       </w:r>
+      <w:proofErr w:type="gramEnd"/>
       <w:r>
         <w:rPr>
           <w:lang w:val="en-US"/>
@@ -895,6 +849,7 @@
         </w:rPr>
         <w:t xml:space="preserve">Verse </w:t>
       </w:r>
+      <w:proofErr w:type="gramStart"/>
       <w:r>
         <w:rPr>
           <w:lang w:val="en-US"/>
@@ -905,7 +860,14 @@
         <w:rPr>
           <w:lang w:val="en-US"/>
         </w:rPr>
-        <w:t>: Baritone Solo</w:t>
+        <w:t>:</w:t>
+      </w:r>
+      <w:proofErr w:type="gramEnd"/>
+      <w:r>
+        <w:rPr>
+          <w:lang w:val="en-US"/>
+        </w:rPr>
+        <w:t xml:space="preserve"> Baritone Solo</w:t>
       </w:r>
     </w:p>
     <w:tbl>
@@ -1104,7 +1066,21 @@
               <w:rPr>
                 <w:lang w:val="en-US"/>
               </w:rPr>
-              <w:t>Singing bell, in the deep silence,</w:t>
+              <w:t xml:space="preserve">Singing bell, in </w:t>
+            </w:r>
+            <w:proofErr w:type="gramStart"/>
+            <w:r>
+              <w:rPr>
+                <w:lang w:val="en-US"/>
+              </w:rPr>
+              <w:t>the deep</w:t>
+            </w:r>
+            <w:proofErr w:type="gramEnd"/>
+            <w:r>
+              <w:rPr>
+                <w:lang w:val="en-US"/>
+              </w:rPr>
+              <w:t xml:space="preserve"> silence,</w:t>
             </w:r>
           </w:p>
         </w:tc>
@@ -1184,7 +1160,6 @@
                 <w:bCs/>
                 <w:lang w:val="oc-FR"/>
               </w:rPr>
-              <w:lastRenderedPageBreak/>
               <w:t>Topazi clar, jos la luna novelà.</w:t>
             </w:r>
           </w:p>
@@ -1228,21 +1203,19 @@
         <w:ind w:left="720"/>
       </w:pPr>
       <w:r>
+        <w:lastRenderedPageBreak/>
         <w:t>Refrain</w:t>
       </w:r>
       <w:r>
+        <w:t xml:space="preserve"> 2</w:t>
+      </w:r>
+      <w:r>
+        <w:t xml:space="preserve"> : Chœur &amp; Sacqueboutes</w:t>
+      </w:r>
+      <w:r>
         <w:t xml:space="preserve"> </w:t>
       </w:r>
       <w:r>
-        <w:t>2</w:t>
-      </w:r>
-      <w:r>
-        <w:t xml:space="preserve"> : Chœur &amp; Sacqueboutes</w:t>
-      </w:r>
-      <w:r>
-        <w:t xml:space="preserve"> </w:t>
-      </w:r>
-      <w:r>
         <w:t xml:space="preserve">/ </w:t>
       </w:r>
       <w:r>
@@ -1251,6 +1224,7 @@
         </w:rPr>
         <w:t xml:space="preserve">Chorus </w:t>
       </w:r>
+      <w:proofErr w:type="gramStart"/>
       <w:r>
         <w:rPr>
           <w:lang w:val="en-US"/>
@@ -1261,7 +1235,14 @@
         <w:rPr>
           <w:lang w:val="en-US"/>
         </w:rPr>
-        <w:t>: Choir &amp; Sackbuts</w:t>
+        <w:t>:</w:t>
+      </w:r>
+      <w:proofErr w:type="gramEnd"/>
+      <w:r>
+        <w:rPr>
+          <w:lang w:val="en-US"/>
+        </w:rPr>
+        <w:t xml:space="preserve"> Choir &amp; Sackbuts</w:t>
       </w:r>
       <w:r>
         <w:t>]</w:t>
@@ -1975,10 +1956,7 @@
         <w:ind w:left="720"/>
       </w:pPr>
       <w:r>
-        <w:t>Final :</w:t>
-      </w:r>
-      <w:r>
-        <w:t xml:space="preserve"> Cor Grave</w:t>
+        <w:t>Final : Cor Grave</w:t>
       </w:r>
       <w:r>
         <w:t xml:space="preserve"> </w:t>
@@ -2202,6 +2180,1227 @@
       </w:tr>
     </w:tbl>
     <w:p/>
+    <w:p>
+      <w:r>
+        <w:br w:type="page"/>
+      </w:r>
+    </w:p>
+    <w:p>
+      <w:pPr>
+        <w:pStyle w:val="Titre1"/>
+        <w:jc w:val="both"/>
+      </w:pPr>
+      <w:r>
+        <w:lastRenderedPageBreak/>
+        <w:t>À propos de la langue et du texte</w:t>
+      </w:r>
+    </w:p>
+    <w:p>
+      <w:pPr>
+        <w:pStyle w:val="Titre2"/>
+        <w:jc w:val="both"/>
+      </w:pPr>
+      <w:r>
+        <w:t>La langue du chant</w:t>
+      </w:r>
+    </w:p>
+    <w:p>
+      <w:pPr>
+        <w:jc w:val="both"/>
+      </w:pPr>
+      <w:r>
+        <w:t>Les paroles de cet hymne sont interprétées en occitan archaïque. Ce texte est le résultat d'une génération par intelligence artificielle, qui a compilé de manière statistique des sources historiques hétérogènes issues de plusieurs régions distinctes de la langue d'oc. Il en résulte une langue hybride, offrant une résonance authentique tout en demeurant une construction artificielle.</w:t>
+      </w:r>
+    </w:p>
+    <w:p>
+      <w:pPr>
+        <w:pStyle w:val="Titre2"/>
+        <w:jc w:val="both"/>
+      </w:pPr>
+      <w:r>
+        <w:t>Un lexique seigneurial</w:t>
+      </w:r>
+    </w:p>
+    <w:p>
+      <w:pPr>
+        <w:jc w:val="both"/>
+      </w:pPr>
+      <w:r>
+        <w:t>Le vocabulaire retenu traduit parfaitement la rudesse du domaine de l'Aigle et la solennité d'une cérémonie d'adoubement :</w:t>
+      </w:r>
+    </w:p>
+    <w:p>
+      <w:pPr>
+        <w:numPr>
+          <w:ilvl w:val="0"/>
+          <w:numId w:val="23"/>
+        </w:numPr>
+        <w:jc w:val="both"/>
+      </w:pPr>
+      <w:proofErr w:type="spellStart"/>
+      <w:r>
+        <w:rPr>
+          <w:i/>
+          <w:iCs/>
+        </w:rPr>
+        <w:t>Valh</w:t>
+      </w:r>
+      <w:proofErr w:type="spellEnd"/>
+      <w:r>
+        <w:rPr>
+          <w:i/>
+          <w:iCs/>
+        </w:rPr>
+        <w:t xml:space="preserve"> de </w:t>
+      </w:r>
+      <w:proofErr w:type="spellStart"/>
+      <w:r>
+        <w:rPr>
+          <w:i/>
+          <w:iCs/>
+        </w:rPr>
+        <w:t>glaç</w:t>
+      </w:r>
+      <w:proofErr w:type="spellEnd"/>
+      <w:r>
+        <w:t xml:space="preserve"> (vallée de glace)</w:t>
+      </w:r>
+    </w:p>
+    <w:p>
+      <w:pPr>
+        <w:numPr>
+          <w:ilvl w:val="0"/>
+          <w:numId w:val="23"/>
+        </w:numPr>
+        <w:jc w:val="both"/>
+      </w:pPr>
+      <w:proofErr w:type="spellStart"/>
+      <w:r>
+        <w:rPr>
+          <w:i/>
+          <w:iCs/>
+        </w:rPr>
+        <w:t>L'aur</w:t>
+      </w:r>
+      <w:proofErr w:type="spellEnd"/>
+      <w:r>
+        <w:rPr>
+          <w:i/>
+          <w:iCs/>
+        </w:rPr>
+        <w:t xml:space="preserve"> e l'azur</w:t>
+      </w:r>
+      <w:r>
+        <w:t xml:space="preserve"> (l'or et l'azur)</w:t>
+      </w:r>
+    </w:p>
+    <w:p>
+      <w:pPr>
+        <w:numPr>
+          <w:ilvl w:val="0"/>
+          <w:numId w:val="23"/>
+        </w:numPr>
+        <w:jc w:val="both"/>
+      </w:pPr>
+      <w:r>
+        <w:rPr>
+          <w:i/>
+          <w:iCs/>
+        </w:rPr>
+        <w:t xml:space="preserve">Le </w:t>
+      </w:r>
+      <w:proofErr w:type="spellStart"/>
+      <w:r>
+        <w:rPr>
+          <w:i/>
+          <w:iCs/>
+        </w:rPr>
+        <w:t>vòt</w:t>
+      </w:r>
+      <w:proofErr w:type="spellEnd"/>
+      <w:r>
+        <w:rPr>
+          <w:i/>
+          <w:iCs/>
+        </w:rPr>
+        <w:t xml:space="preserve"> es </w:t>
+      </w:r>
+      <w:proofErr w:type="spellStart"/>
+      <w:r>
+        <w:rPr>
+          <w:i/>
+          <w:iCs/>
+        </w:rPr>
+        <w:t>prestat</w:t>
+      </w:r>
+      <w:proofErr w:type="spellEnd"/>
+      <w:r>
+        <w:t xml:space="preserve"> (le vœu est prêté)</w:t>
+      </w:r>
+    </w:p>
+    <w:p>
+      <w:pPr>
+        <w:pStyle w:val="Titre2"/>
+        <w:jc w:val="both"/>
+      </w:pPr>
+      <w:r>
+        <w:t>Anomalies de génération linguistique</w:t>
+      </w:r>
+    </w:p>
+    <w:p>
+      <w:pPr>
+        <w:jc w:val="both"/>
+      </w:pPr>
+      <w:r>
+        <w:t>La méthode algorithmique a engendré plusieurs incohérences syntaxiques et sémantiques, qui ont été conservées dans l'enregistrement final :</w:t>
+      </w:r>
+    </w:p>
+    <w:p>
+      <w:pPr>
+        <w:numPr>
+          <w:ilvl w:val="0"/>
+          <w:numId w:val="24"/>
+        </w:numPr>
+        <w:jc w:val="both"/>
+      </w:pPr>
+      <w:r>
+        <w:rPr>
+          <w:b/>
+          <w:bCs/>
+        </w:rPr>
+        <w:t>Collision des dialectes :</w:t>
+      </w:r>
+      <w:r>
+        <w:t xml:space="preserve"> Le mot "vallée" s'écrit d'abord </w:t>
+      </w:r>
+      <w:proofErr w:type="spellStart"/>
+      <w:r>
+        <w:rPr>
+          <w:i/>
+          <w:iCs/>
+        </w:rPr>
+        <w:t>valh</w:t>
+      </w:r>
+      <w:proofErr w:type="spellEnd"/>
+      <w:r>
+        <w:t xml:space="preserve"> (orthographe languedocienne classique), puis devient </w:t>
+      </w:r>
+      <w:proofErr w:type="spellStart"/>
+      <w:r>
+        <w:rPr>
+          <w:i/>
+          <w:iCs/>
+        </w:rPr>
+        <w:t>vath</w:t>
+      </w:r>
+      <w:proofErr w:type="spellEnd"/>
+      <w:r>
+        <w:rPr>
+          <w:i/>
+          <w:iCs/>
+        </w:rPr>
+        <w:t xml:space="preserve"> </w:t>
+      </w:r>
+      <w:proofErr w:type="spellStart"/>
+      <w:r>
+        <w:rPr>
+          <w:i/>
+          <w:iCs/>
+        </w:rPr>
+        <w:t>nauta</w:t>
+      </w:r>
+      <w:proofErr w:type="spellEnd"/>
+      <w:r>
+        <w:t xml:space="preserve"> dans le pont, important soudainement et sans justification la phonétique du gascon pyrénéen.</w:t>
+      </w:r>
+    </w:p>
+    <w:p>
+      <w:pPr>
+        <w:numPr>
+          <w:ilvl w:val="0"/>
+          <w:numId w:val="24"/>
+        </w:numPr>
+        <w:jc w:val="both"/>
+      </w:pPr>
+      <w:r>
+        <w:rPr>
+          <w:b/>
+          <w:bCs/>
+        </w:rPr>
+        <w:t>Inconstance grammaticale :</w:t>
+      </w:r>
+      <w:r>
+        <w:t xml:space="preserve"> L'article défini masculin alterne aléatoirement entre </w:t>
+      </w:r>
+      <w:r>
+        <w:rPr>
+          <w:i/>
+          <w:iCs/>
+        </w:rPr>
+        <w:t>lo</w:t>
+      </w:r>
+      <w:r>
+        <w:t xml:space="preserve"> et </w:t>
+      </w:r>
+      <w:r>
+        <w:rPr>
+          <w:i/>
+          <w:iCs/>
+        </w:rPr>
+        <w:t>le</w:t>
+      </w:r>
+      <w:r>
+        <w:t>.</w:t>
+      </w:r>
+    </w:p>
+    <w:p>
+      <w:pPr>
+        <w:numPr>
+          <w:ilvl w:val="0"/>
+          <w:numId w:val="24"/>
+        </w:numPr>
+        <w:jc w:val="both"/>
+      </w:pPr>
+      <w:r>
+        <w:rPr>
+          <w:b/>
+          <w:bCs/>
+        </w:rPr>
+        <w:t>Mélange géographique :</w:t>
+      </w:r>
+      <w:r>
+        <w:t xml:space="preserve"> Le texte utilise deux prépositions régionales différentes pour dire "sous" : </w:t>
+      </w:r>
+      <w:proofErr w:type="spellStart"/>
+      <w:r>
+        <w:rPr>
+          <w:i/>
+          <w:iCs/>
+        </w:rPr>
+        <w:t>sota</w:t>
+      </w:r>
+      <w:proofErr w:type="spellEnd"/>
+      <w:r>
+        <w:t xml:space="preserve"> (d'influence provençale) et </w:t>
+      </w:r>
+      <w:proofErr w:type="spellStart"/>
+      <w:r>
+        <w:rPr>
+          <w:i/>
+          <w:iCs/>
+        </w:rPr>
+        <w:t>jos</w:t>
+      </w:r>
+      <w:proofErr w:type="spellEnd"/>
+      <w:r>
+        <w:t xml:space="preserve"> (d'influence languedocienne).</w:t>
+      </w:r>
+    </w:p>
+    <w:p>
+      <w:pPr>
+        <w:numPr>
+          <w:ilvl w:val="0"/>
+          <w:numId w:val="24"/>
+        </w:numPr>
+        <w:jc w:val="both"/>
+      </w:pPr>
+      <w:r>
+        <w:rPr>
+          <w:b/>
+          <w:bCs/>
+        </w:rPr>
+        <w:t>Rime artificielle :</w:t>
+      </w:r>
+      <w:r>
+        <w:t xml:space="preserve"> Pour forcer une rime avec </w:t>
+      </w:r>
+      <w:r>
+        <w:rPr>
+          <w:i/>
+          <w:iCs/>
+        </w:rPr>
+        <w:t>flama de bronze</w:t>
+      </w:r>
+      <w:r>
+        <w:t xml:space="preserve">, l'IA a inventé de toutes pièces l'expression </w:t>
+      </w:r>
+      <w:proofErr w:type="spellStart"/>
+      <w:r>
+        <w:rPr>
+          <w:i/>
+          <w:iCs/>
+        </w:rPr>
+        <w:t>silenci</w:t>
+      </w:r>
+      <w:proofErr w:type="spellEnd"/>
+      <w:r>
+        <w:rPr>
+          <w:i/>
+          <w:iCs/>
+        </w:rPr>
+        <w:t xml:space="preserve"> d'onze</w:t>
+      </w:r>
+      <w:r>
+        <w:t xml:space="preserve"> (littéralement "le silence de onze") pour traduire l'intention "silence profond".</w:t>
+      </w:r>
+    </w:p>
+    <w:p>
+      <w:pPr>
+        <w:numPr>
+          <w:ilvl w:val="0"/>
+          <w:numId w:val="24"/>
+        </w:numPr>
+        <w:jc w:val="both"/>
+      </w:pPr>
+      <w:r>
+        <w:rPr>
+          <w:b/>
+          <w:bCs/>
+        </w:rPr>
+        <w:t>Le contresens de la "raca" :</w:t>
+      </w:r>
+      <w:r>
+        <w:t xml:space="preserve"> Pour traduire "que le peuple demeure protégé", l'IA a généré la phrase </w:t>
+      </w:r>
+      <w:r>
+        <w:rPr>
+          <w:i/>
+          <w:iCs/>
+        </w:rPr>
+        <w:t xml:space="preserve">« e que la raca </w:t>
+      </w:r>
+      <w:proofErr w:type="spellStart"/>
+      <w:r>
+        <w:rPr>
+          <w:i/>
+          <w:iCs/>
+        </w:rPr>
+        <w:t>demòre</w:t>
+      </w:r>
+      <w:proofErr w:type="spellEnd"/>
+      <w:r>
+        <w:rPr>
+          <w:i/>
+          <w:iCs/>
+        </w:rPr>
+        <w:t xml:space="preserve"> </w:t>
+      </w:r>
+      <w:proofErr w:type="spellStart"/>
+      <w:r>
+        <w:rPr>
+          <w:i/>
+          <w:iCs/>
+        </w:rPr>
+        <w:t>protegida</w:t>
+      </w:r>
+      <w:proofErr w:type="spellEnd"/>
+      <w:r>
+        <w:rPr>
+          <w:i/>
+          <w:iCs/>
+        </w:rPr>
+        <w:t xml:space="preserve"> »</w:t>
+      </w:r>
+      <w:r>
+        <w:t xml:space="preserve">. L'utilisation de </w:t>
+      </w:r>
+      <w:r>
+        <w:rPr>
+          <w:i/>
+          <w:iCs/>
+        </w:rPr>
+        <w:t>raca</w:t>
+      </w:r>
+      <w:r>
+        <w:t>, terme désignant un animal de peu de valeur, s'explique par deux hypothèses :</w:t>
+      </w:r>
+    </w:p>
+    <w:p>
+      <w:pPr>
+        <w:numPr>
+          <w:ilvl w:val="1"/>
+          <w:numId w:val="24"/>
+        </w:numPr>
+        <w:jc w:val="both"/>
+      </w:pPr>
+      <w:r>
+        <w:rPr>
+          <w:b/>
+          <w:bCs/>
+        </w:rPr>
+        <w:t>Pollution par un corpus moderne :</w:t>
+      </w:r>
+      <w:r>
+        <w:t xml:space="preserve"> L'IA s'est appuyée sur des textes administratifs et écologiques récents (en occitan, espagnol ou catalan), où l'on évoque fréquemment la "protection" d'une bête ou d'une espèce locale.</w:t>
+      </w:r>
+    </w:p>
+    <w:p>
+      <w:pPr>
+        <w:numPr>
+          <w:ilvl w:val="1"/>
+          <w:numId w:val="24"/>
+        </w:numPr>
+        <w:jc w:val="both"/>
+      </w:pPr>
+      <w:r>
+        <w:rPr>
+          <w:b/>
+          <w:bCs/>
+        </w:rPr>
+        <w:t>Erreur de caractère :</w:t>
+      </w:r>
+      <w:r>
+        <w:t xml:space="preserve"> L'IA ciblait le terme archaïque </w:t>
+      </w:r>
+      <w:proofErr w:type="spellStart"/>
+      <w:r>
+        <w:rPr>
+          <w:i/>
+          <w:iCs/>
+        </w:rPr>
+        <w:t>raça</w:t>
+      </w:r>
+      <w:proofErr w:type="spellEnd"/>
+      <w:r>
+        <w:t xml:space="preserve"> (qui désignait historiquement la "lignée" ou le "clan" d'une maison noble) mais a simplement perdu la cédille lors du traitement informatique du texte.</w:t>
+      </w:r>
+    </w:p>
+    <w:p>
+      <w:pPr>
+        <w:pStyle w:val="Titre1"/>
+        <w:jc w:val="both"/>
+        <w:rPr>
+          <w:lang w:val="en-US"/>
+        </w:rPr>
+      </w:pPr>
+      <w:r>
+        <w:rPr>
+          <w:lang w:val="en-US"/>
+        </w:rPr>
+        <w:lastRenderedPageBreak/>
+        <w:t>About the Language and Lyrics</w:t>
+      </w:r>
+    </w:p>
+    <w:p>
+      <w:pPr>
+        <w:pStyle w:val="Titre2"/>
+        <w:rPr>
+          <w:lang w:val="en-US"/>
+        </w:rPr>
+      </w:pPr>
+      <w:r>
+        <w:rPr>
+          <w:lang w:val="en-US"/>
+        </w:rPr>
+        <w:t>Song Language</w:t>
+      </w:r>
+    </w:p>
+    <w:p>
+      <w:pPr>
+        <w:jc w:val="both"/>
+        <w:rPr>
+          <w:lang w:val="en-US"/>
+        </w:rPr>
+      </w:pPr>
+      <w:r>
+        <w:rPr>
+          <w:lang w:val="en-US"/>
+        </w:rPr>
+        <w:t xml:space="preserve">The lyrics of this hymn are performed in archaic Occitan. The text is the result of artificial intelligence generation, which statistically compiled heterogeneous historical sources from various distinct regions of the Langue </w:t>
+      </w:r>
+      <w:proofErr w:type="spellStart"/>
+      <w:r>
+        <w:rPr>
+          <w:lang w:val="en-US"/>
+        </w:rPr>
+        <w:t>d'Oc</w:t>
+      </w:r>
+      <w:proofErr w:type="spellEnd"/>
+      <w:r>
+        <w:rPr>
+          <w:lang w:val="en-US"/>
+        </w:rPr>
+        <w:t>. The outcome is a hybrid language, offering an authentic resonance while remaining an artificial construct.</w:t>
+      </w:r>
+    </w:p>
+    <w:p>
+      <w:pPr>
+        <w:pStyle w:val="Titre2"/>
+        <w:rPr>
+          <w:lang w:val="en-US"/>
+        </w:rPr>
+      </w:pPr>
+      <w:r>
+        <w:rPr>
+          <w:lang w:val="en-US"/>
+        </w:rPr>
+        <w:t>A Solemn and Seigneurial Lexicon</w:t>
+      </w:r>
+    </w:p>
+    <w:p>
+      <w:pPr>
+        <w:jc w:val="both"/>
+        <w:rPr>
+          <w:lang w:val="en-US"/>
+        </w:rPr>
+      </w:pPr>
+      <w:r>
+        <w:rPr>
+          <w:lang w:val="en-US"/>
+        </w:rPr>
+        <w:t>The selected vocabulary perfectly conveys the harshness of the Eagle's domain and the solemnity of a knighting ceremony:</w:t>
+      </w:r>
+    </w:p>
+    <w:p>
+      <w:pPr>
+        <w:numPr>
+          <w:ilvl w:val="0"/>
+          <w:numId w:val="25"/>
+        </w:numPr>
+        <w:jc w:val="both"/>
+        <w:rPr>
+          <w:lang w:val="en-US"/>
+        </w:rPr>
+      </w:pPr>
+      <w:proofErr w:type="spellStart"/>
+      <w:r>
+        <w:rPr>
+          <w:i/>
+          <w:iCs/>
+          <w:lang w:val="en-US"/>
+        </w:rPr>
+        <w:t>Valh</w:t>
+      </w:r>
+      <w:proofErr w:type="spellEnd"/>
+      <w:r>
+        <w:rPr>
+          <w:i/>
+          <w:iCs/>
+          <w:lang w:val="en-US"/>
+        </w:rPr>
+        <w:t xml:space="preserve"> de </w:t>
+      </w:r>
+      <w:proofErr w:type="spellStart"/>
+      <w:r>
+        <w:rPr>
+          <w:i/>
+          <w:iCs/>
+          <w:lang w:val="en-US"/>
+        </w:rPr>
+        <w:t>glaç</w:t>
+      </w:r>
+      <w:proofErr w:type="spellEnd"/>
+      <w:r>
+        <w:rPr>
+          <w:lang w:val="en-US"/>
+        </w:rPr>
+        <w:t xml:space="preserve"> (valley of ice)</w:t>
+      </w:r>
+    </w:p>
+    <w:p>
+      <w:pPr>
+        <w:numPr>
+          <w:ilvl w:val="0"/>
+          <w:numId w:val="25"/>
+        </w:numPr>
+        <w:jc w:val="both"/>
+        <w:rPr>
+          <w:lang w:val="en-US"/>
+        </w:rPr>
+      </w:pPr>
+      <w:proofErr w:type="spellStart"/>
+      <w:r>
+        <w:rPr>
+          <w:i/>
+          <w:iCs/>
+          <w:lang w:val="en-US"/>
+        </w:rPr>
+        <w:t>L'aur</w:t>
+      </w:r>
+      <w:proofErr w:type="spellEnd"/>
+      <w:r>
+        <w:rPr>
+          <w:i/>
+          <w:iCs/>
+          <w:lang w:val="en-US"/>
+        </w:rPr>
+        <w:t xml:space="preserve"> e </w:t>
+      </w:r>
+      <w:proofErr w:type="spellStart"/>
+      <w:r>
+        <w:rPr>
+          <w:i/>
+          <w:iCs/>
+          <w:lang w:val="en-US"/>
+        </w:rPr>
+        <w:t>l'azur</w:t>
+      </w:r>
+      <w:proofErr w:type="spellEnd"/>
+      <w:r>
+        <w:rPr>
+          <w:lang w:val="en-US"/>
+        </w:rPr>
+        <w:t xml:space="preserve"> (gold and azure)</w:t>
+      </w:r>
+    </w:p>
+    <w:p>
+      <w:pPr>
+        <w:numPr>
+          <w:ilvl w:val="0"/>
+          <w:numId w:val="25"/>
+        </w:numPr>
+        <w:jc w:val="both"/>
+        <w:rPr>
+          <w:lang w:val="en-US"/>
+        </w:rPr>
+      </w:pPr>
+      <w:r>
+        <w:rPr>
+          <w:i/>
+          <w:iCs/>
+          <w:lang w:val="en-US"/>
+        </w:rPr>
+        <w:t xml:space="preserve">Le </w:t>
+      </w:r>
+      <w:proofErr w:type="spellStart"/>
+      <w:r>
+        <w:rPr>
+          <w:i/>
+          <w:iCs/>
+          <w:lang w:val="en-US"/>
+        </w:rPr>
+        <w:t>vòt</w:t>
+      </w:r>
+      <w:proofErr w:type="spellEnd"/>
+      <w:r>
+        <w:rPr>
+          <w:i/>
+          <w:iCs/>
+          <w:lang w:val="en-US"/>
+        </w:rPr>
+        <w:t xml:space="preserve"> es </w:t>
+      </w:r>
+      <w:proofErr w:type="spellStart"/>
+      <w:r>
+        <w:rPr>
+          <w:i/>
+          <w:iCs/>
+          <w:lang w:val="en-US"/>
+        </w:rPr>
+        <w:t>prestat</w:t>
+      </w:r>
+      <w:proofErr w:type="spellEnd"/>
+      <w:r>
+        <w:rPr>
+          <w:lang w:val="en-US"/>
+        </w:rPr>
+        <w:t xml:space="preserve"> (the vow is sworn)</w:t>
+      </w:r>
+    </w:p>
+    <w:p>
+      <w:pPr>
+        <w:pStyle w:val="Titre2"/>
+        <w:rPr>
+          <w:lang w:val="en-US"/>
+        </w:rPr>
+      </w:pPr>
+      <w:r>
+        <w:rPr>
+          <w:lang w:val="en-US"/>
+        </w:rPr>
+        <w:t>Linguistic Generation Anomalies</w:t>
+      </w:r>
+    </w:p>
+    <w:p>
+      <w:pPr>
+        <w:jc w:val="both"/>
+        <w:rPr>
+          <w:lang w:val="en-US"/>
+        </w:rPr>
+      </w:pPr>
+      <w:r>
+        <w:rPr>
+          <w:lang w:val="en-US"/>
+        </w:rPr>
+        <w:t>The algorithmic method generated several syntactic and semantic inconsistencies, which were kept in the final recording:</w:t>
+      </w:r>
+    </w:p>
+    <w:p>
+      <w:pPr>
+        <w:numPr>
+          <w:ilvl w:val="0"/>
+          <w:numId w:val="26"/>
+        </w:numPr>
+        <w:jc w:val="both"/>
+        <w:rPr>
+          <w:lang w:val="en-US"/>
+        </w:rPr>
+      </w:pPr>
+      <w:r>
+        <w:rPr>
+          <w:b/>
+          <w:bCs/>
+          <w:lang w:val="en-US"/>
+        </w:rPr>
+        <w:t>Dialect Collision:</w:t>
+      </w:r>
+      <w:r>
+        <w:rPr>
+          <w:lang w:val="en-US"/>
+        </w:rPr>
+        <w:t xml:space="preserve"> The word for "valley" is first written as </w:t>
+      </w:r>
+      <w:proofErr w:type="spellStart"/>
+      <w:r>
+        <w:rPr>
+          <w:i/>
+          <w:iCs/>
+          <w:lang w:val="en-US"/>
+        </w:rPr>
+        <w:t>valh</w:t>
+      </w:r>
+      <w:proofErr w:type="spellEnd"/>
+      <w:r>
+        <w:rPr>
+          <w:lang w:val="en-US"/>
+        </w:rPr>
+        <w:t xml:space="preserve"> (classic </w:t>
+      </w:r>
+      <w:proofErr w:type="spellStart"/>
+      <w:r>
+        <w:rPr>
+          <w:lang w:val="en-US"/>
+        </w:rPr>
+        <w:t>Languedocian</w:t>
+      </w:r>
+      <w:proofErr w:type="spellEnd"/>
+      <w:r>
+        <w:rPr>
+          <w:lang w:val="en-US"/>
+        </w:rPr>
+        <w:t xml:space="preserve"> spelling), then becomes </w:t>
+      </w:r>
+      <w:proofErr w:type="spellStart"/>
+      <w:r>
+        <w:rPr>
+          <w:i/>
+          <w:iCs/>
+          <w:lang w:val="en-US"/>
+        </w:rPr>
+        <w:t>vath</w:t>
+      </w:r>
+      <w:proofErr w:type="spellEnd"/>
+      <w:r>
+        <w:rPr>
+          <w:i/>
+          <w:iCs/>
+          <w:lang w:val="en-US"/>
+        </w:rPr>
+        <w:t xml:space="preserve"> </w:t>
+      </w:r>
+      <w:proofErr w:type="spellStart"/>
+      <w:r>
+        <w:rPr>
+          <w:i/>
+          <w:iCs/>
+          <w:lang w:val="en-US"/>
+        </w:rPr>
+        <w:t>nauta</w:t>
+      </w:r>
+      <w:proofErr w:type="spellEnd"/>
+      <w:r>
+        <w:rPr>
+          <w:lang w:val="en-US"/>
+        </w:rPr>
+        <w:t xml:space="preserve"> in the bridge, suddenly importing the specific phonetics of Pyrenean Gascon without grammatical justification.</w:t>
+      </w:r>
+    </w:p>
+    <w:p>
+      <w:pPr>
+        <w:numPr>
+          <w:ilvl w:val="0"/>
+          <w:numId w:val="26"/>
+        </w:numPr>
+        <w:jc w:val="both"/>
+        <w:rPr>
+          <w:lang w:val="en-US"/>
+        </w:rPr>
+      </w:pPr>
+      <w:r>
+        <w:rPr>
+          <w:b/>
+          <w:bCs/>
+          <w:lang w:val="en-US"/>
+        </w:rPr>
+        <w:t>Grammatical Inconsistency:</w:t>
+      </w:r>
+      <w:r>
+        <w:rPr>
+          <w:lang w:val="en-US"/>
+        </w:rPr>
+        <w:t xml:space="preserve"> The masculine definite article randomly alternates between </w:t>
+      </w:r>
+      <w:r>
+        <w:rPr>
+          <w:i/>
+          <w:iCs/>
+          <w:lang w:val="en-US"/>
+        </w:rPr>
+        <w:t>lo</w:t>
+      </w:r>
+      <w:r>
+        <w:rPr>
+          <w:lang w:val="en-US"/>
+        </w:rPr>
+        <w:t xml:space="preserve"> and </w:t>
+      </w:r>
+      <w:r>
+        <w:rPr>
+          <w:i/>
+          <w:iCs/>
+          <w:lang w:val="en-US"/>
+        </w:rPr>
+        <w:t>le</w:t>
+      </w:r>
+      <w:r>
+        <w:rPr>
+          <w:lang w:val="en-US"/>
+        </w:rPr>
+        <w:t>.</w:t>
+      </w:r>
+    </w:p>
+    <w:p>
+      <w:pPr>
+        <w:numPr>
+          <w:ilvl w:val="0"/>
+          <w:numId w:val="26"/>
+        </w:numPr>
+        <w:jc w:val="both"/>
+        <w:rPr>
+          <w:lang w:val="en-US"/>
+        </w:rPr>
+      </w:pPr>
+      <w:r>
+        <w:rPr>
+          <w:b/>
+          <w:bCs/>
+          <w:lang w:val="en-US"/>
+        </w:rPr>
+        <w:t>Geographical Mixing:</w:t>
+      </w:r>
+      <w:r>
+        <w:rPr>
+          <w:lang w:val="en-US"/>
+        </w:rPr>
+        <w:t xml:space="preserve"> The text uses two different regional prepositions for "under": </w:t>
+      </w:r>
+      <w:proofErr w:type="spellStart"/>
+      <w:r>
+        <w:rPr>
+          <w:i/>
+          <w:iCs/>
+          <w:lang w:val="en-US"/>
+        </w:rPr>
+        <w:t>sota</w:t>
+      </w:r>
+      <w:proofErr w:type="spellEnd"/>
+      <w:r>
+        <w:rPr>
+          <w:lang w:val="en-US"/>
+        </w:rPr>
+        <w:t xml:space="preserve"> (Provençal influence) and </w:t>
+      </w:r>
+      <w:proofErr w:type="spellStart"/>
+      <w:r>
+        <w:rPr>
+          <w:i/>
+          <w:iCs/>
+          <w:lang w:val="en-US"/>
+        </w:rPr>
+        <w:t>jos</w:t>
+      </w:r>
+      <w:proofErr w:type="spellEnd"/>
+      <w:r>
+        <w:rPr>
+          <w:lang w:val="en-US"/>
+        </w:rPr>
+        <w:t xml:space="preserve"> (</w:t>
+      </w:r>
+      <w:proofErr w:type="spellStart"/>
+      <w:r>
+        <w:rPr>
+          <w:lang w:val="en-US"/>
+        </w:rPr>
+        <w:t>Languedocian</w:t>
+      </w:r>
+      <w:proofErr w:type="spellEnd"/>
+      <w:r>
+        <w:rPr>
+          <w:lang w:val="en-US"/>
+        </w:rPr>
+        <w:t xml:space="preserve"> influence).</w:t>
+      </w:r>
+    </w:p>
+    <w:p>
+      <w:pPr>
+        <w:numPr>
+          <w:ilvl w:val="0"/>
+          <w:numId w:val="26"/>
+        </w:numPr>
+        <w:jc w:val="both"/>
+        <w:rPr>
+          <w:lang w:val="en-US"/>
+        </w:rPr>
+      </w:pPr>
+      <w:r>
+        <w:rPr>
+          <w:b/>
+          <w:bCs/>
+          <w:lang w:val="en-US"/>
+        </w:rPr>
+        <w:t>Artificial Rhyme:</w:t>
+      </w:r>
+      <w:r>
+        <w:rPr>
+          <w:lang w:val="en-US"/>
+        </w:rPr>
+        <w:t xml:space="preserve"> To force a rhyme with </w:t>
+      </w:r>
+      <w:proofErr w:type="spellStart"/>
+      <w:r>
+        <w:rPr>
+          <w:i/>
+          <w:iCs/>
+          <w:lang w:val="en-US"/>
+        </w:rPr>
+        <w:t>flama</w:t>
+      </w:r>
+      <w:proofErr w:type="spellEnd"/>
+      <w:r>
+        <w:rPr>
+          <w:i/>
+          <w:iCs/>
+          <w:lang w:val="en-US"/>
+        </w:rPr>
+        <w:t xml:space="preserve"> de bronze</w:t>
+      </w:r>
+      <w:r>
+        <w:rPr>
+          <w:lang w:val="en-US"/>
+        </w:rPr>
+        <w:t xml:space="preserve">, the AI completely invented the expression </w:t>
+      </w:r>
+      <w:proofErr w:type="spellStart"/>
+      <w:r>
+        <w:rPr>
+          <w:i/>
+          <w:iCs/>
+          <w:lang w:val="en-US"/>
+        </w:rPr>
+        <w:t>silenci</w:t>
+      </w:r>
+      <w:proofErr w:type="spellEnd"/>
+      <w:r>
+        <w:rPr>
+          <w:i/>
+          <w:iCs/>
+          <w:lang w:val="en-US"/>
+        </w:rPr>
+        <w:t xml:space="preserve"> </w:t>
+      </w:r>
+      <w:proofErr w:type="spellStart"/>
+      <w:r>
+        <w:rPr>
+          <w:i/>
+          <w:iCs/>
+          <w:lang w:val="en-US"/>
+        </w:rPr>
+        <w:t>d'onze</w:t>
+      </w:r>
+      <w:proofErr w:type="spellEnd"/>
+      <w:r>
+        <w:rPr>
+          <w:lang w:val="en-US"/>
+        </w:rPr>
+        <w:t xml:space="preserve"> (literally "the silence of eleven") to translate the intended meaning "deep silence".</w:t>
+      </w:r>
+    </w:p>
+    <w:p>
+      <w:pPr>
+        <w:numPr>
+          <w:ilvl w:val="0"/>
+          <w:numId w:val="26"/>
+        </w:numPr>
+        <w:jc w:val="both"/>
+        <w:rPr>
+          <w:lang w:val="en-US"/>
+        </w:rPr>
+      </w:pPr>
+      <w:r>
+        <w:rPr>
+          <w:b/>
+          <w:bCs/>
+          <w:lang w:val="en-US"/>
+        </w:rPr>
+        <w:t>The "Raca" Misinterpretation:</w:t>
+      </w:r>
+      <w:r>
+        <w:rPr>
+          <w:lang w:val="en-US"/>
+        </w:rPr>
+        <w:t xml:space="preserve"> To translate "let the people remain protected", the AI generated the phrase </w:t>
+      </w:r>
+      <w:r>
+        <w:rPr>
+          <w:i/>
+          <w:iCs/>
+          <w:lang w:val="en-US"/>
+        </w:rPr>
+        <w:t xml:space="preserve">« e </w:t>
+      </w:r>
+      <w:proofErr w:type="spellStart"/>
+      <w:r>
+        <w:rPr>
+          <w:i/>
+          <w:iCs/>
+          <w:lang w:val="en-US"/>
+        </w:rPr>
+        <w:t>que</w:t>
+      </w:r>
+      <w:proofErr w:type="spellEnd"/>
+      <w:r>
+        <w:rPr>
+          <w:i/>
+          <w:iCs/>
+          <w:lang w:val="en-US"/>
+        </w:rPr>
+        <w:t xml:space="preserve"> la raca </w:t>
+      </w:r>
+      <w:proofErr w:type="spellStart"/>
+      <w:r>
+        <w:rPr>
+          <w:i/>
+          <w:iCs/>
+          <w:lang w:val="en-US"/>
+        </w:rPr>
+        <w:t>demòre</w:t>
+      </w:r>
+      <w:proofErr w:type="spellEnd"/>
+      <w:r>
+        <w:rPr>
+          <w:i/>
+          <w:iCs/>
+          <w:lang w:val="en-US"/>
+        </w:rPr>
+        <w:t xml:space="preserve"> </w:t>
+      </w:r>
+      <w:proofErr w:type="spellStart"/>
+      <w:r>
+        <w:rPr>
+          <w:i/>
+          <w:iCs/>
+          <w:lang w:val="en-US"/>
+        </w:rPr>
+        <w:t>protegida</w:t>
+      </w:r>
+      <w:proofErr w:type="spellEnd"/>
+      <w:r>
+        <w:rPr>
+          <w:i/>
+          <w:iCs/>
+          <w:lang w:val="en-US"/>
+        </w:rPr>
+        <w:t xml:space="preserve"> »</w:t>
+      </w:r>
+      <w:r>
+        <w:rPr>
+          <w:lang w:val="en-US"/>
+        </w:rPr>
+        <w:t xml:space="preserve">. The use of </w:t>
+      </w:r>
+      <w:r>
+        <w:rPr>
+          <w:i/>
+          <w:iCs/>
+          <w:lang w:val="en-US"/>
+        </w:rPr>
+        <w:t>raca</w:t>
+      </w:r>
+      <w:r>
+        <w:rPr>
+          <w:lang w:val="en-US"/>
+        </w:rPr>
+        <w:t>, a term designating a worthless animal, can be explained by two hypotheses:</w:t>
+      </w:r>
+    </w:p>
+    <w:p>
+      <w:pPr>
+        <w:numPr>
+          <w:ilvl w:val="1"/>
+          <w:numId w:val="26"/>
+        </w:numPr>
+        <w:jc w:val="both"/>
+        <w:rPr>
+          <w:lang w:val="en-US"/>
+        </w:rPr>
+      </w:pPr>
+      <w:r>
+        <w:rPr>
+          <w:b/>
+          <w:bCs/>
+          <w:lang w:val="en-US"/>
+        </w:rPr>
+        <w:t>Modern Corpus Pollution:</w:t>
+      </w:r>
+      <w:r>
+        <w:rPr>
+          <w:lang w:val="en-US"/>
+        </w:rPr>
+        <w:t xml:space="preserve"> The AI relied on recent administrative and ecological texts (in Occitan, Spanish, or Catalan), which frequently discuss the "protection" of a local animal or species.</w:t>
+      </w:r>
+    </w:p>
+    <w:p>
+      <w:pPr>
+        <w:numPr>
+          <w:ilvl w:val="1"/>
+          <w:numId w:val="26"/>
+        </w:numPr>
+        <w:jc w:val="both"/>
+        <w:rPr>
+          <w:lang w:val="en-US"/>
+        </w:rPr>
+      </w:pPr>
+      <w:r>
+        <w:rPr>
+          <w:b/>
+          <w:bCs/>
+          <w:lang w:val="en-US"/>
+        </w:rPr>
+        <w:t>Typographical Error:</w:t>
+      </w:r>
+      <w:r>
+        <w:rPr>
+          <w:lang w:val="en-US"/>
+        </w:rPr>
+        <w:t xml:space="preserve"> The AI targeted the archaic term </w:t>
+      </w:r>
+      <w:proofErr w:type="spellStart"/>
+      <w:r>
+        <w:rPr>
+          <w:i/>
+          <w:iCs/>
+          <w:lang w:val="en-US"/>
+        </w:rPr>
+        <w:t>raça</w:t>
+      </w:r>
+      <w:proofErr w:type="spellEnd"/>
+      <w:r>
+        <w:rPr>
+          <w:lang w:val="en-US"/>
+        </w:rPr>
+        <w:t xml:space="preserve"> (which historically designated the "lineage" or "clan" of a noble house) but simply lost the cedilla during the computational processing of the text.</w:t>
+      </w:r>
+    </w:p>
     <w:sectPr>
       <w:headerReference w:type="default" r:id="rId7"/>
       <w:pgSz w:w="11906" w:h="16838"/>
@@ -3686,6 +4885,151 @@
     </w:lvl>
   </w:abstractNum>
   <w:abstractNum w:abstractNumId="10" w15:restartNumberingAfterBreak="0">
+    <w:nsid w:val="37364D51"/>
+    <w:multiLevelType w:val="multilevel"/>
+    <w:tmpl w:val="B2201BF0"/>
+    <w:lvl w:ilvl="0">
+      <w:start w:val="1"/>
+      <w:numFmt w:val="bullet"/>
+      <w:lvlText w:val=""/>
+      <w:lvlJc w:val="left"/>
+      <w:pPr>
+        <w:tabs>
+          <w:tab w:val="num" w:pos="720"/>
+        </w:tabs>
+        <w:ind w:left="720" w:hanging="360"/>
+      </w:pPr>
+      <w:rPr>
+        <w:rFonts w:ascii="Symbol" w:hAnsi="Symbol" w:hint="default"/>
+        <w:sz w:val="20"/>
+      </w:rPr>
+    </w:lvl>
+    <w:lvl w:ilvl="1">
+      <w:start w:val="1"/>
+      <w:numFmt w:val="decimal"/>
+      <w:lvlText w:val="%2."/>
+      <w:lvlJc w:val="left"/>
+      <w:pPr>
+        <w:tabs>
+          <w:tab w:val="num" w:pos="1440"/>
+        </w:tabs>
+        <w:ind w:left="1440" w:hanging="360"/>
+      </w:pPr>
+    </w:lvl>
+    <w:lvl w:ilvl="2" w:tentative="1">
+      <w:start w:val="1"/>
+      <w:numFmt w:val="bullet"/>
+      <w:lvlText w:val=""/>
+      <w:lvlJc w:val="left"/>
+      <w:pPr>
+        <w:tabs>
+          <w:tab w:val="num" w:pos="2160"/>
+        </w:tabs>
+        <w:ind w:left="2160" w:hanging="360"/>
+      </w:pPr>
+      <w:rPr>
+        <w:rFonts w:ascii="Wingdings" w:hAnsi="Wingdings" w:hint="default"/>
+        <w:sz w:val="20"/>
+      </w:rPr>
+    </w:lvl>
+    <w:lvl w:ilvl="3" w:tentative="1">
+      <w:start w:val="1"/>
+      <w:numFmt w:val="bullet"/>
+      <w:lvlText w:val=""/>
+      <w:lvlJc w:val="left"/>
+      <w:pPr>
+        <w:tabs>
+          <w:tab w:val="num" w:pos="2880"/>
+        </w:tabs>
+        <w:ind w:left="2880" w:hanging="360"/>
+      </w:pPr>
+      <w:rPr>
+        <w:rFonts w:ascii="Wingdings" w:hAnsi="Wingdings" w:hint="default"/>
+        <w:sz w:val="20"/>
+      </w:rPr>
+    </w:lvl>
+    <w:lvl w:ilvl="4" w:tentative="1">
+      <w:start w:val="1"/>
+      <w:numFmt w:val="bullet"/>
+      <w:lvlText w:val=""/>
+      <w:lvlJc w:val="left"/>
+      <w:pPr>
+        <w:tabs>
+          <w:tab w:val="num" w:pos="3600"/>
+        </w:tabs>
+        <w:ind w:left="3600" w:hanging="360"/>
+      </w:pPr>
+      <w:rPr>
+        <w:rFonts w:ascii="Wingdings" w:hAnsi="Wingdings" w:hint="default"/>
+        <w:sz w:val="20"/>
+      </w:rPr>
+    </w:lvl>
+    <w:lvl w:ilvl="5" w:tentative="1">
+      <w:start w:val="1"/>
+      <w:numFmt w:val="bullet"/>
+      <w:lvlText w:val=""/>
+      <w:lvlJc w:val="left"/>
+      <w:pPr>
+        <w:tabs>
+          <w:tab w:val="num" w:pos="4320"/>
+        </w:tabs>
+        <w:ind w:left="4320" w:hanging="360"/>
+      </w:pPr>
+      <w:rPr>
+        <w:rFonts w:ascii="Wingdings" w:hAnsi="Wingdings" w:hint="default"/>
+        <w:sz w:val="20"/>
+      </w:rPr>
+    </w:lvl>
+    <w:lvl w:ilvl="6" w:tentative="1">
+      <w:start w:val="1"/>
+      <w:numFmt w:val="bullet"/>
+      <w:lvlText w:val=""/>
+      <w:lvlJc w:val="left"/>
+      <w:pPr>
+        <w:tabs>
+          <w:tab w:val="num" w:pos="5040"/>
+        </w:tabs>
+        <w:ind w:left="5040" w:hanging="360"/>
+      </w:pPr>
+      <w:rPr>
+        <w:rFonts w:ascii="Wingdings" w:hAnsi="Wingdings" w:hint="default"/>
+        <w:sz w:val="20"/>
+      </w:rPr>
+    </w:lvl>
+    <w:lvl w:ilvl="7" w:tentative="1">
+      <w:start w:val="1"/>
+      <w:numFmt w:val="bullet"/>
+      <w:lvlText w:val=""/>
+      <w:lvlJc w:val="left"/>
+      <w:pPr>
+        <w:tabs>
+          <w:tab w:val="num" w:pos="5760"/>
+        </w:tabs>
+        <w:ind w:left="5760" w:hanging="360"/>
+      </w:pPr>
+      <w:rPr>
+        <w:rFonts w:ascii="Wingdings" w:hAnsi="Wingdings" w:hint="default"/>
+        <w:sz w:val="20"/>
+      </w:rPr>
+    </w:lvl>
+    <w:lvl w:ilvl="8" w:tentative="1">
+      <w:start w:val="1"/>
+      <w:numFmt w:val="bullet"/>
+      <w:lvlText w:val=""/>
+      <w:lvlJc w:val="left"/>
+      <w:pPr>
+        <w:tabs>
+          <w:tab w:val="num" w:pos="6480"/>
+        </w:tabs>
+        <w:ind w:left="6480" w:hanging="360"/>
+      </w:pPr>
+      <w:rPr>
+        <w:rFonts w:ascii="Wingdings" w:hAnsi="Wingdings" w:hint="default"/>
+        <w:sz w:val="20"/>
+      </w:rPr>
+    </w:lvl>
+  </w:abstractNum>
+  <w:abstractNum w:abstractNumId="11" w15:restartNumberingAfterBreak="0">
     <w:nsid w:val="3F4D1F6E"/>
     <w:multiLevelType w:val="multilevel"/>
     <w:tmpl w:val="FE72E9B6"/>
@@ -3830,7 +5174,7 @@
       </w:rPr>
     </w:lvl>
   </w:abstractNum>
-  <w:abstractNum w:abstractNumId="11" w15:restartNumberingAfterBreak="0">
+  <w:abstractNum w:abstractNumId="12" w15:restartNumberingAfterBreak="0">
     <w:nsid w:val="45005675"/>
     <w:multiLevelType w:val="multilevel"/>
     <w:tmpl w:val="1640DBA4"/>
@@ -3975,7 +5319,7 @@
       </w:rPr>
     </w:lvl>
   </w:abstractNum>
-  <w:abstractNum w:abstractNumId="12" w15:restartNumberingAfterBreak="0">
+  <w:abstractNum w:abstractNumId="13" w15:restartNumberingAfterBreak="0">
     <w:nsid w:val="54883176"/>
     <w:multiLevelType w:val="multilevel"/>
     <w:tmpl w:val="93D01220"/>
@@ -4124,7 +5468,7 @@
       </w:rPr>
     </w:lvl>
   </w:abstractNum>
-  <w:abstractNum w:abstractNumId="13" w15:restartNumberingAfterBreak="0">
+  <w:abstractNum w:abstractNumId="14" w15:restartNumberingAfterBreak="0">
     <w:nsid w:val="56054D89"/>
     <w:multiLevelType w:val="multilevel"/>
     <w:tmpl w:val="83DCEF78"/>
@@ -4273,7 +5617,7 @@
       </w:rPr>
     </w:lvl>
   </w:abstractNum>
-  <w:abstractNum w:abstractNumId="14" w15:restartNumberingAfterBreak="0">
+  <w:abstractNum w:abstractNumId="15" w15:restartNumberingAfterBreak="0">
     <w:nsid w:val="564E2D81"/>
     <w:multiLevelType w:val="hybridMultilevel"/>
     <w:tmpl w:val="CFFA1FCA"/>
@@ -4359,7 +5703,305 @@
       </w:pPr>
     </w:lvl>
   </w:abstractNum>
-  <w:abstractNum w:abstractNumId="15" w15:restartNumberingAfterBreak="0">
+  <w:abstractNum w:abstractNumId="16" w15:restartNumberingAfterBreak="0">
+    <w:nsid w:val="58A91205"/>
+    <w:multiLevelType w:val="multilevel"/>
+    <w:tmpl w:val="E18C4BE4"/>
+    <w:lvl w:ilvl="0">
+      <w:start w:val="1"/>
+      <w:numFmt w:val="bullet"/>
+      <w:lvlText w:val=""/>
+      <w:lvlJc w:val="left"/>
+      <w:pPr>
+        <w:tabs>
+          <w:tab w:val="num" w:pos="720"/>
+        </w:tabs>
+        <w:ind w:left="720" w:hanging="360"/>
+      </w:pPr>
+      <w:rPr>
+        <w:rFonts w:ascii="Symbol" w:hAnsi="Symbol" w:hint="default"/>
+        <w:sz w:val="20"/>
+      </w:rPr>
+    </w:lvl>
+    <w:lvl w:ilvl="1" w:tentative="1">
+      <w:start w:val="1"/>
+      <w:numFmt w:val="bullet"/>
+      <w:lvlText w:val="o"/>
+      <w:lvlJc w:val="left"/>
+      <w:pPr>
+        <w:tabs>
+          <w:tab w:val="num" w:pos="1440"/>
+        </w:tabs>
+        <w:ind w:left="1440" w:hanging="360"/>
+      </w:pPr>
+      <w:rPr>
+        <w:rFonts w:ascii="Courier New" w:hAnsi="Courier New" w:hint="default"/>
+        <w:sz w:val="20"/>
+      </w:rPr>
+    </w:lvl>
+    <w:lvl w:ilvl="2" w:tentative="1">
+      <w:start w:val="1"/>
+      <w:numFmt w:val="bullet"/>
+      <w:lvlText w:val=""/>
+      <w:lvlJc w:val="left"/>
+      <w:pPr>
+        <w:tabs>
+          <w:tab w:val="num" w:pos="2160"/>
+        </w:tabs>
+        <w:ind w:left="2160" w:hanging="360"/>
+      </w:pPr>
+      <w:rPr>
+        <w:rFonts w:ascii="Wingdings" w:hAnsi="Wingdings" w:hint="default"/>
+        <w:sz w:val="20"/>
+      </w:rPr>
+    </w:lvl>
+    <w:lvl w:ilvl="3" w:tentative="1">
+      <w:start w:val="1"/>
+      <w:numFmt w:val="bullet"/>
+      <w:lvlText w:val=""/>
+      <w:lvlJc w:val="left"/>
+      <w:pPr>
+        <w:tabs>
+          <w:tab w:val="num" w:pos="2880"/>
+        </w:tabs>
+        <w:ind w:left="2880" w:hanging="360"/>
+      </w:pPr>
+      <w:rPr>
+        <w:rFonts w:ascii="Wingdings" w:hAnsi="Wingdings" w:hint="default"/>
+        <w:sz w:val="20"/>
+      </w:rPr>
+    </w:lvl>
+    <w:lvl w:ilvl="4" w:tentative="1">
+      <w:start w:val="1"/>
+      <w:numFmt w:val="bullet"/>
+      <w:lvlText w:val=""/>
+      <w:lvlJc w:val="left"/>
+      <w:pPr>
+        <w:tabs>
+          <w:tab w:val="num" w:pos="3600"/>
+        </w:tabs>
+        <w:ind w:left="3600" w:hanging="360"/>
+      </w:pPr>
+      <w:rPr>
+        <w:rFonts w:ascii="Wingdings" w:hAnsi="Wingdings" w:hint="default"/>
+        <w:sz w:val="20"/>
+      </w:rPr>
+    </w:lvl>
+    <w:lvl w:ilvl="5" w:tentative="1">
+      <w:start w:val="1"/>
+      <w:numFmt w:val="bullet"/>
+      <w:lvlText w:val=""/>
+      <w:lvlJc w:val="left"/>
+      <w:pPr>
+        <w:tabs>
+          <w:tab w:val="num" w:pos="4320"/>
+        </w:tabs>
+        <w:ind w:left="4320" w:hanging="360"/>
+      </w:pPr>
+      <w:rPr>
+        <w:rFonts w:ascii="Wingdings" w:hAnsi="Wingdings" w:hint="default"/>
+        <w:sz w:val="20"/>
+      </w:rPr>
+    </w:lvl>
+    <w:lvl w:ilvl="6" w:tentative="1">
+      <w:start w:val="1"/>
+      <w:numFmt w:val="bullet"/>
+      <w:lvlText w:val=""/>
+      <w:lvlJc w:val="left"/>
+      <w:pPr>
+        <w:tabs>
+          <w:tab w:val="num" w:pos="5040"/>
+        </w:tabs>
+        <w:ind w:left="5040" w:hanging="360"/>
+      </w:pPr>
+      <w:rPr>
+        <w:rFonts w:ascii="Wingdings" w:hAnsi="Wingdings" w:hint="default"/>
+        <w:sz w:val="20"/>
+      </w:rPr>
+    </w:lvl>
+    <w:lvl w:ilvl="7" w:tentative="1">
+      <w:start w:val="1"/>
+      <w:numFmt w:val="bullet"/>
+      <w:lvlText w:val=""/>
+      <w:lvlJc w:val="left"/>
+      <w:pPr>
+        <w:tabs>
+          <w:tab w:val="num" w:pos="5760"/>
+        </w:tabs>
+        <w:ind w:left="5760" w:hanging="360"/>
+      </w:pPr>
+      <w:rPr>
+        <w:rFonts w:ascii="Wingdings" w:hAnsi="Wingdings" w:hint="default"/>
+        <w:sz w:val="20"/>
+      </w:rPr>
+    </w:lvl>
+    <w:lvl w:ilvl="8" w:tentative="1">
+      <w:start w:val="1"/>
+      <w:numFmt w:val="bullet"/>
+      <w:lvlText w:val=""/>
+      <w:lvlJc w:val="left"/>
+      <w:pPr>
+        <w:tabs>
+          <w:tab w:val="num" w:pos="6480"/>
+        </w:tabs>
+        <w:ind w:left="6480" w:hanging="360"/>
+      </w:pPr>
+      <w:rPr>
+        <w:rFonts w:ascii="Wingdings" w:hAnsi="Wingdings" w:hint="default"/>
+        <w:sz w:val="20"/>
+      </w:rPr>
+    </w:lvl>
+  </w:abstractNum>
+  <w:abstractNum w:abstractNumId="17" w15:restartNumberingAfterBreak="0">
+    <w:nsid w:val="5DFD0627"/>
+    <w:multiLevelType w:val="multilevel"/>
+    <w:tmpl w:val="4626B2DC"/>
+    <w:lvl w:ilvl="0">
+      <w:start w:val="1"/>
+      <w:numFmt w:val="bullet"/>
+      <w:lvlText w:val=""/>
+      <w:lvlJc w:val="left"/>
+      <w:pPr>
+        <w:tabs>
+          <w:tab w:val="num" w:pos="720"/>
+        </w:tabs>
+        <w:ind w:left="720" w:hanging="360"/>
+      </w:pPr>
+      <w:rPr>
+        <w:rFonts w:ascii="Symbol" w:hAnsi="Symbol" w:hint="default"/>
+        <w:sz w:val="20"/>
+      </w:rPr>
+    </w:lvl>
+    <w:lvl w:ilvl="1" w:tentative="1">
+      <w:start w:val="1"/>
+      <w:numFmt w:val="bullet"/>
+      <w:lvlText w:val="o"/>
+      <w:lvlJc w:val="left"/>
+      <w:pPr>
+        <w:tabs>
+          <w:tab w:val="num" w:pos="1440"/>
+        </w:tabs>
+        <w:ind w:left="1440" w:hanging="360"/>
+      </w:pPr>
+      <w:rPr>
+        <w:rFonts w:ascii="Courier New" w:hAnsi="Courier New" w:hint="default"/>
+        <w:sz w:val="20"/>
+      </w:rPr>
+    </w:lvl>
+    <w:lvl w:ilvl="2" w:tentative="1">
+      <w:start w:val="1"/>
+      <w:numFmt w:val="bullet"/>
+      <w:lvlText w:val=""/>
+      <w:lvlJc w:val="left"/>
+      <w:pPr>
+        <w:tabs>
+          <w:tab w:val="num" w:pos="2160"/>
+        </w:tabs>
+        <w:ind w:left="2160" w:hanging="360"/>
+      </w:pPr>
+      <w:rPr>
+        <w:rFonts w:ascii="Wingdings" w:hAnsi="Wingdings" w:hint="default"/>
+        <w:sz w:val="20"/>
+      </w:rPr>
+    </w:lvl>
+    <w:lvl w:ilvl="3" w:tentative="1">
+      <w:start w:val="1"/>
+      <w:numFmt w:val="bullet"/>
+      <w:lvlText w:val=""/>
+      <w:lvlJc w:val="left"/>
+      <w:pPr>
+        <w:tabs>
+          <w:tab w:val="num" w:pos="2880"/>
+        </w:tabs>
+        <w:ind w:left="2880" w:hanging="360"/>
+      </w:pPr>
+      <w:rPr>
+        <w:rFonts w:ascii="Wingdings" w:hAnsi="Wingdings" w:hint="default"/>
+        <w:sz w:val="20"/>
+      </w:rPr>
+    </w:lvl>
+    <w:lvl w:ilvl="4" w:tentative="1">
+      <w:start w:val="1"/>
+      <w:numFmt w:val="bullet"/>
+      <w:lvlText w:val=""/>
+      <w:lvlJc w:val="left"/>
+      <w:pPr>
+        <w:tabs>
+          <w:tab w:val="num" w:pos="3600"/>
+        </w:tabs>
+        <w:ind w:left="3600" w:hanging="360"/>
+      </w:pPr>
+      <w:rPr>
+        <w:rFonts w:ascii="Wingdings" w:hAnsi="Wingdings" w:hint="default"/>
+        <w:sz w:val="20"/>
+      </w:rPr>
+    </w:lvl>
+    <w:lvl w:ilvl="5" w:tentative="1">
+      <w:start w:val="1"/>
+      <w:numFmt w:val="bullet"/>
+      <w:lvlText w:val=""/>
+      <w:lvlJc w:val="left"/>
+      <w:pPr>
+        <w:tabs>
+          <w:tab w:val="num" w:pos="4320"/>
+        </w:tabs>
+        <w:ind w:left="4320" w:hanging="360"/>
+      </w:pPr>
+      <w:rPr>
+        <w:rFonts w:ascii="Wingdings" w:hAnsi="Wingdings" w:hint="default"/>
+        <w:sz w:val="20"/>
+      </w:rPr>
+    </w:lvl>
+    <w:lvl w:ilvl="6" w:tentative="1">
+      <w:start w:val="1"/>
+      <w:numFmt w:val="bullet"/>
+      <w:lvlText w:val=""/>
+      <w:lvlJc w:val="left"/>
+      <w:pPr>
+        <w:tabs>
+          <w:tab w:val="num" w:pos="5040"/>
+        </w:tabs>
+        <w:ind w:left="5040" w:hanging="360"/>
+      </w:pPr>
+      <w:rPr>
+        <w:rFonts w:ascii="Wingdings" w:hAnsi="Wingdings" w:hint="default"/>
+        <w:sz w:val="20"/>
+      </w:rPr>
+    </w:lvl>
+    <w:lvl w:ilvl="7" w:tentative="1">
+      <w:start w:val="1"/>
+      <w:numFmt w:val="bullet"/>
+      <w:lvlText w:val=""/>
+      <w:lvlJc w:val="left"/>
+      <w:pPr>
+        <w:tabs>
+          <w:tab w:val="num" w:pos="5760"/>
+        </w:tabs>
+        <w:ind w:left="5760" w:hanging="360"/>
+      </w:pPr>
+      <w:rPr>
+        <w:rFonts w:ascii="Wingdings" w:hAnsi="Wingdings" w:hint="default"/>
+        <w:sz w:val="20"/>
+      </w:rPr>
+    </w:lvl>
+    <w:lvl w:ilvl="8" w:tentative="1">
+      <w:start w:val="1"/>
+      <w:numFmt w:val="bullet"/>
+      <w:lvlText w:val=""/>
+      <w:lvlJc w:val="left"/>
+      <w:pPr>
+        <w:tabs>
+          <w:tab w:val="num" w:pos="6480"/>
+        </w:tabs>
+        <w:ind w:left="6480" w:hanging="360"/>
+      </w:pPr>
+      <w:rPr>
+        <w:rFonts w:ascii="Wingdings" w:hAnsi="Wingdings" w:hint="default"/>
+        <w:sz w:val="20"/>
+      </w:rPr>
+    </w:lvl>
+  </w:abstractNum>
+  <w:abstractNum w:abstractNumId="18" w15:restartNumberingAfterBreak="0">
     <w:nsid w:val="65E13772"/>
     <w:multiLevelType w:val="multilevel"/>
     <w:tmpl w:val="AF1A0A04"/>
@@ -4508,7 +6150,7 @@
       </w:rPr>
     </w:lvl>
   </w:abstractNum>
-  <w:abstractNum w:abstractNumId="16" w15:restartNumberingAfterBreak="0">
+  <w:abstractNum w:abstractNumId="19" w15:restartNumberingAfterBreak="0">
     <w:nsid w:val="68A127A8"/>
     <w:multiLevelType w:val="multilevel"/>
     <w:tmpl w:val="2BBAEDD8"/>
@@ -4621,7 +6263,152 @@
       </w:pPr>
     </w:lvl>
   </w:abstractNum>
-  <w:abstractNum w:abstractNumId="17" w15:restartNumberingAfterBreak="0">
+  <w:abstractNum w:abstractNumId="20" w15:restartNumberingAfterBreak="0">
+    <w:nsid w:val="68B07B50"/>
+    <w:multiLevelType w:val="multilevel"/>
+    <w:tmpl w:val="E25ED6E8"/>
+    <w:lvl w:ilvl="0">
+      <w:start w:val="1"/>
+      <w:numFmt w:val="bullet"/>
+      <w:lvlText w:val=""/>
+      <w:lvlJc w:val="left"/>
+      <w:pPr>
+        <w:tabs>
+          <w:tab w:val="num" w:pos="720"/>
+        </w:tabs>
+        <w:ind w:left="720" w:hanging="360"/>
+      </w:pPr>
+      <w:rPr>
+        <w:rFonts w:ascii="Symbol" w:hAnsi="Symbol" w:hint="default"/>
+        <w:sz w:val="20"/>
+      </w:rPr>
+    </w:lvl>
+    <w:lvl w:ilvl="1">
+      <w:start w:val="1"/>
+      <w:numFmt w:val="decimal"/>
+      <w:lvlText w:val="%2."/>
+      <w:lvlJc w:val="left"/>
+      <w:pPr>
+        <w:tabs>
+          <w:tab w:val="num" w:pos="1440"/>
+        </w:tabs>
+        <w:ind w:left="1440" w:hanging="360"/>
+      </w:pPr>
+    </w:lvl>
+    <w:lvl w:ilvl="2" w:tentative="1">
+      <w:start w:val="1"/>
+      <w:numFmt w:val="bullet"/>
+      <w:lvlText w:val=""/>
+      <w:lvlJc w:val="left"/>
+      <w:pPr>
+        <w:tabs>
+          <w:tab w:val="num" w:pos="2160"/>
+        </w:tabs>
+        <w:ind w:left="2160" w:hanging="360"/>
+      </w:pPr>
+      <w:rPr>
+        <w:rFonts w:ascii="Wingdings" w:hAnsi="Wingdings" w:hint="default"/>
+        <w:sz w:val="20"/>
+      </w:rPr>
+    </w:lvl>
+    <w:lvl w:ilvl="3" w:tentative="1">
+      <w:start w:val="1"/>
+      <w:numFmt w:val="bullet"/>
+      <w:lvlText w:val=""/>
+      <w:lvlJc w:val="left"/>
+      <w:pPr>
+        <w:tabs>
+          <w:tab w:val="num" w:pos="2880"/>
+        </w:tabs>
+        <w:ind w:left="2880" w:hanging="360"/>
+      </w:pPr>
+      <w:rPr>
+        <w:rFonts w:ascii="Wingdings" w:hAnsi="Wingdings" w:hint="default"/>
+        <w:sz w:val="20"/>
+      </w:rPr>
+    </w:lvl>
+    <w:lvl w:ilvl="4" w:tentative="1">
+      <w:start w:val="1"/>
+      <w:numFmt w:val="bullet"/>
+      <w:lvlText w:val=""/>
+      <w:lvlJc w:val="left"/>
+      <w:pPr>
+        <w:tabs>
+          <w:tab w:val="num" w:pos="3600"/>
+        </w:tabs>
+        <w:ind w:left="3600" w:hanging="360"/>
+      </w:pPr>
+      <w:rPr>
+        <w:rFonts w:ascii="Wingdings" w:hAnsi="Wingdings" w:hint="default"/>
+        <w:sz w:val="20"/>
+      </w:rPr>
+    </w:lvl>
+    <w:lvl w:ilvl="5" w:tentative="1">
+      <w:start w:val="1"/>
+      <w:numFmt w:val="bullet"/>
+      <w:lvlText w:val=""/>
+      <w:lvlJc w:val="left"/>
+      <w:pPr>
+        <w:tabs>
+          <w:tab w:val="num" w:pos="4320"/>
+        </w:tabs>
+        <w:ind w:left="4320" w:hanging="360"/>
+      </w:pPr>
+      <w:rPr>
+        <w:rFonts w:ascii="Wingdings" w:hAnsi="Wingdings" w:hint="default"/>
+        <w:sz w:val="20"/>
+      </w:rPr>
+    </w:lvl>
+    <w:lvl w:ilvl="6" w:tentative="1">
+      <w:start w:val="1"/>
+      <w:numFmt w:val="bullet"/>
+      <w:lvlText w:val=""/>
+      <w:lvlJc w:val="left"/>
+      <w:pPr>
+        <w:tabs>
+          <w:tab w:val="num" w:pos="5040"/>
+        </w:tabs>
+        <w:ind w:left="5040" w:hanging="360"/>
+      </w:pPr>
+      <w:rPr>
+        <w:rFonts w:ascii="Wingdings" w:hAnsi="Wingdings" w:hint="default"/>
+        <w:sz w:val="20"/>
+      </w:rPr>
+    </w:lvl>
+    <w:lvl w:ilvl="7" w:tentative="1">
+      <w:start w:val="1"/>
+      <w:numFmt w:val="bullet"/>
+      <w:lvlText w:val=""/>
+      <w:lvlJc w:val="left"/>
+      <w:pPr>
+        <w:tabs>
+          <w:tab w:val="num" w:pos="5760"/>
+        </w:tabs>
+        <w:ind w:left="5760" w:hanging="360"/>
+      </w:pPr>
+      <w:rPr>
+        <w:rFonts w:ascii="Wingdings" w:hAnsi="Wingdings" w:hint="default"/>
+        <w:sz w:val="20"/>
+      </w:rPr>
+    </w:lvl>
+    <w:lvl w:ilvl="8" w:tentative="1">
+      <w:start w:val="1"/>
+      <w:numFmt w:val="bullet"/>
+      <w:lvlText w:val=""/>
+      <w:lvlJc w:val="left"/>
+      <w:pPr>
+        <w:tabs>
+          <w:tab w:val="num" w:pos="6480"/>
+        </w:tabs>
+        <w:ind w:left="6480" w:hanging="360"/>
+      </w:pPr>
+      <w:rPr>
+        <w:rFonts w:ascii="Wingdings" w:hAnsi="Wingdings" w:hint="default"/>
+        <w:sz w:val="20"/>
+      </w:rPr>
+    </w:lvl>
+  </w:abstractNum>
+  <w:abstractNum w:abstractNumId="21" w15:restartNumberingAfterBreak="0">
     <w:nsid w:val="6E156FB4"/>
     <w:multiLevelType w:val="multilevel"/>
     <w:tmpl w:val="33B4FAD2"/>
@@ -4770,7 +6557,7 @@
       </w:rPr>
     </w:lvl>
   </w:abstractNum>
-  <w:abstractNum w:abstractNumId="18" w15:restartNumberingAfterBreak="0">
+  <w:abstractNum w:abstractNumId="22" w15:restartNumberingAfterBreak="0">
     <w:nsid w:val="71436E90"/>
     <w:multiLevelType w:val="multilevel"/>
     <w:tmpl w:val="C24C824A"/>
@@ -4883,7 +6670,7 @@
       </w:pPr>
     </w:lvl>
   </w:abstractNum>
-  <w:abstractNum w:abstractNumId="19" w15:restartNumberingAfterBreak="0">
+  <w:abstractNum w:abstractNumId="23" w15:restartNumberingAfterBreak="0">
     <w:nsid w:val="72003DFB"/>
     <w:multiLevelType w:val="multilevel"/>
     <w:tmpl w:val="1D103B7A"/>
@@ -5032,7 +6819,7 @@
       </w:rPr>
     </w:lvl>
   </w:abstractNum>
-  <w:abstractNum w:abstractNumId="20" w15:restartNumberingAfterBreak="0">
+  <w:abstractNum w:abstractNumId="24" w15:restartNumberingAfterBreak="0">
     <w:nsid w:val="743B58EB"/>
     <w:multiLevelType w:val="multilevel"/>
     <w:tmpl w:val="F46C7964"/>
@@ -5181,7 +6968,7 @@
       </w:rPr>
     </w:lvl>
   </w:abstractNum>
-  <w:abstractNum w:abstractNumId="21" w15:restartNumberingAfterBreak="0">
+  <w:abstractNum w:abstractNumId="25" w15:restartNumberingAfterBreak="0">
     <w:nsid w:val="749301ED"/>
     <w:multiLevelType w:val="hybridMultilevel"/>
     <w:tmpl w:val="58FC4CA6"/>
@@ -5271,7 +7058,7 @@
     </w:lvl>
   </w:abstractNum>
   <w:num w:numId="1" w16cid:durableId="1441340094">
-    <w:abstractNumId w:val="12"/>
+    <w:abstractNumId w:val="13"/>
   </w:num>
   <w:num w:numId="2" w16cid:durableId="1303123695">
     <w:abstractNumId w:val="7"/>
@@ -5280,10 +7067,10 @@
     <w:abstractNumId w:val="3"/>
   </w:num>
   <w:num w:numId="4" w16cid:durableId="1786994686">
-    <w:abstractNumId w:val="18"/>
+    <w:abstractNumId w:val="22"/>
   </w:num>
   <w:num w:numId="5" w16cid:durableId="2060544868">
-    <w:abstractNumId w:val="16"/>
+    <w:abstractNumId w:val="19"/>
   </w:num>
   <w:num w:numId="6" w16cid:durableId="563217560">
     <w:abstractNumId w:val="5"/>
@@ -5301,40 +7088,52 @@
     <w:abstractNumId w:val="4"/>
   </w:num>
   <w:num w:numId="11" w16cid:durableId="1803645088">
-    <w:abstractNumId w:val="14"/>
+    <w:abstractNumId w:val="15"/>
   </w:num>
   <w:num w:numId="12" w16cid:durableId="1690524091">
-    <w:abstractNumId w:val="21"/>
+    <w:abstractNumId w:val="25"/>
   </w:num>
   <w:num w:numId="13" w16cid:durableId="2057510817">
     <w:abstractNumId w:val="0"/>
   </w:num>
   <w:num w:numId="14" w16cid:durableId="1518813204">
+    <w:abstractNumId w:val="12"/>
+  </w:num>
+  <w:num w:numId="15" w16cid:durableId="823349978">
+    <w:abstractNumId w:val="24"/>
+  </w:num>
+  <w:num w:numId="16" w16cid:durableId="1113592895">
     <w:abstractNumId w:val="11"/>
   </w:num>
-  <w:num w:numId="15" w16cid:durableId="823349978">
-    <w:abstractNumId w:val="20"/>
-  </w:num>
-  <w:num w:numId="16" w16cid:durableId="1113592895">
-    <w:abstractNumId w:val="10"/>
-  </w:num>
   <w:num w:numId="17" w16cid:durableId="1147940976">
-    <w:abstractNumId w:val="13"/>
+    <w:abstractNumId w:val="14"/>
   </w:num>
   <w:num w:numId="18" w16cid:durableId="1095442807">
-    <w:abstractNumId w:val="15"/>
+    <w:abstractNumId w:val="18"/>
   </w:num>
   <w:num w:numId="19" w16cid:durableId="1229002789">
     <w:abstractNumId w:val="6"/>
   </w:num>
   <w:num w:numId="20" w16cid:durableId="464273381">
-    <w:abstractNumId w:val="19"/>
+    <w:abstractNumId w:val="23"/>
   </w:num>
   <w:num w:numId="21" w16cid:durableId="2110808300">
-    <w:abstractNumId w:val="17"/>
+    <w:abstractNumId w:val="21"/>
   </w:num>
   <w:num w:numId="22" w16cid:durableId="16515952">
     <w:abstractNumId w:val="1"/>
+  </w:num>
+  <w:num w:numId="23" w16cid:durableId="259266198">
+    <w:abstractNumId w:val="17"/>
+  </w:num>
+  <w:num w:numId="24" w16cid:durableId="278338733">
+    <w:abstractNumId w:val="10"/>
+  </w:num>
+  <w:num w:numId="25" w16cid:durableId="1609316925">
+    <w:abstractNumId w:val="16"/>
+  </w:num>
+  <w:num w:numId="26" w16cid:durableId="113135451">
+    <w:abstractNumId w:val="20"/>
   </w:num>
 </w:numbering>
 </file>

</xml_diff>

<commit_message>
Ajout d'une introduction aux paroles du chant de l'Aigle
</commit_message>
<xml_diff>
--- a/assets/Terre-de-Barons-TB7-Eagle-Crest-Lyrics.docx
+++ b/assets/Terre-de-Barons-TB7-Eagle-Crest-Lyrics.docx
@@ -2,6 +2,71 @@
 <file path=word/document.xml><?xml version="1.0" encoding="utf-8"?>
 <w:document xmlns:wpc="http://schemas.microsoft.com/office/word/2010/wordprocessingCanvas" xmlns:cx="http://schemas.microsoft.com/office/drawing/2014/chartex" xmlns:cx1="http://schemas.microsoft.com/office/drawing/2015/9/8/chartex" xmlns:cx2="http://schemas.microsoft.com/office/drawing/2015/10/21/chartex" xmlns:cx3="http://schemas.microsoft.com/office/drawing/2016/5/9/chartex" xmlns:cx4="http://schemas.microsoft.com/office/drawing/2016/5/10/chartex" xmlns:cx5="http://schemas.microsoft.com/office/drawing/2016/5/11/chartex" xmlns:cx6="http://schemas.microsoft.com/office/drawing/2016/5/12/chartex" xmlns:cx7="http://schemas.microsoft.com/office/drawing/2016/5/13/chartex" xmlns:cx8="http://schemas.microsoft.com/office/drawing/2016/5/14/chartex" xmlns:mc="http://schemas.openxmlformats.org/markup-compatibility/2006" xmlns:aink="http://schemas.microsoft.com/office/drawing/2016/ink" xmlns:am3d="http://schemas.microsoft.com/office/drawing/2017/model3d" xmlns:o="urn:schemas-microsoft-com:office:office" xmlns:oel="http://schemas.microsoft.com/office/2019/extlst" xmlns:r="http://schemas.openxmlformats.org/officeDocument/2006/relationships" xmlns:m="http://schemas.openxmlformats.org/officeDocument/2006/math" xmlns:v="urn:schemas-microsoft-com:vml" xmlns:wp14="http://schemas.microsoft.com/office/word/2010/wordprocessingDrawing" xmlns:wp="http://schemas.openxmlformats.org/drawingml/2006/wordprocessingDrawing" xmlns:w10="urn:schemas-microsoft-com:office:word" xmlns:w="http://schemas.openxmlformats.org/wordprocessingml/2006/main" xmlns:w14="http://schemas.microsoft.com/office/word/2010/wordml" xmlns:w15="http://schemas.microsoft.com/office/word/2012/wordml" xmlns:w16cex="http://schemas.microsoft.com/office/word/2018/wordml/cex" xmlns:w16cid="http://schemas.microsoft.com/office/word/2016/wordml/cid" xmlns:w16="http://schemas.microsoft.com/office/word/2018/wordml" xmlns:w16du="http://schemas.microsoft.com/office/word/2023/wordml/word16du" xmlns:w16sdtdh="http://schemas.microsoft.com/office/word/2020/wordml/sdtdatahash" xmlns:w16sdtfl="http://schemas.microsoft.com/office/word/2024/wordml/sdtformatlock" xmlns:w16se="http://schemas.microsoft.com/office/word/2015/wordml/symex" xmlns:wpg="http://schemas.microsoft.com/office/word/2010/wordprocessingGroup" xmlns:wpi="http://schemas.microsoft.com/office/word/2010/wordprocessingInk" xmlns:wne="http://schemas.microsoft.com/office/word/2006/wordml" xmlns:wps="http://schemas.microsoft.com/office/word/2010/wordprocessingShape" mc:Ignorable="w14 w15 w16se w16cid w16 w16cex w16sdtdh w16sdtfl w16du wp14">
   <w:body>
+    <w:p>
+      <w:pPr>
+        <w:jc w:val="both"/>
+      </w:pPr>
+      <w:r>
+        <w:rPr>
+          <w:b/>
+          <w:bCs/>
+        </w:rPr>
+        <w:t>Note sur la langue du chant</w:t>
+      </w:r>
+      <w:r>
+        <w:t xml:space="preserve"> </w:t>
+      </w:r>
+      <w:r>
+        <w:t xml:space="preserve">– </w:t>
+      </w:r>
+      <w:r>
+        <w:t>Les paroles de cet hymne sont interprétées dans un occitan archaïque hybride, généré par intelligence artificielle. Les détails concernant les particularités de ce lexique seigneurial et ses anomalies linguistiques sont expliqués à la fin de ce document, après les paroles.</w:t>
+      </w:r>
+    </w:p>
+    <w:p>
+      <w:pPr>
+        <w:jc w:val="both"/>
+        <w:rPr>
+          <w:lang w:val="en-US"/>
+        </w:rPr>
+      </w:pPr>
+      <w:r>
+        <w:rPr>
+          <w:b/>
+          <w:bCs/>
+          <w:lang w:val="en-US"/>
+        </w:rPr>
+        <w:t xml:space="preserve">Note on the Song's </w:t>
+      </w:r>
+      <w:proofErr w:type="gramStart"/>
+      <w:r>
+        <w:rPr>
+          <w:b/>
+          <w:bCs/>
+          <w:lang w:val="en-US"/>
+        </w:rPr>
+        <w:t>Language</w:t>
+      </w:r>
+      <w:r>
+        <w:rPr>
+          <w:lang w:val="en-US"/>
+        </w:rPr>
+        <w:t xml:space="preserve">  –</w:t>
+      </w:r>
+      <w:proofErr w:type="gramEnd"/>
+      <w:r>
+        <w:rPr>
+          <w:lang w:val="en-US"/>
+        </w:rPr>
+        <w:t xml:space="preserve"> </w:t>
+      </w:r>
+      <w:r>
+        <w:rPr>
+          <w:lang w:val="en-US"/>
+        </w:rPr>
+        <w:t>The lyrics of this hymn are performed in a hybrid archaic Occitan, generated by artificial intelligence. Details regarding the peculiarities of this seigneurial lexicon and its linguistic anomalies are explained at the end of this document, after the lyrics.</w:t>
+      </w:r>
+    </w:p>
     <w:p>
       <w:pPr>
         <w:pStyle w:val="Titre1"/>
@@ -1036,6 +1101,7 @@
                 <w:bCs/>
                 <w:lang w:val="oc-FR"/>
               </w:rPr>
+              <w:lastRenderedPageBreak/>
               <w:t>Clocha que canta, dins lo silenci d'onze,</w:t>
             </w:r>
           </w:p>
@@ -1203,7 +1269,6 @@
         <w:ind w:left="720"/>
       </w:pPr>
       <w:r>
-        <w:lastRenderedPageBreak/>
         <w:t>Refrain</w:t>
       </w:r>
       <w:r>
@@ -4001,6 +4066,118 @@
     </w:lvl>
   </w:abstractNum>
   <w:abstractNum w:abstractNumId="3" w15:restartNumberingAfterBreak="0">
+    <w:nsid w:val="0CFD7944"/>
+    <w:multiLevelType w:val="hybridMultilevel"/>
+    <w:tmpl w:val="6E123EFA"/>
+    <w:lvl w:ilvl="0" w:tplc="DF042366">
+      <w:numFmt w:val="bullet"/>
+      <w:lvlText w:val=""/>
+      <w:lvlJc w:val="left"/>
+      <w:pPr>
+        <w:ind w:left="720" w:hanging="360"/>
+      </w:pPr>
+      <w:rPr>
+        <w:rFonts w:ascii="Wingdings" w:eastAsiaTheme="minorHAnsi" w:hAnsi="Wingdings" w:cstheme="minorBidi" w:hint="default"/>
+      </w:rPr>
+    </w:lvl>
+    <w:lvl w:ilvl="1" w:tplc="040C0003" w:tentative="1">
+      <w:start w:val="1"/>
+      <w:numFmt w:val="bullet"/>
+      <w:lvlText w:val="o"/>
+      <w:lvlJc w:val="left"/>
+      <w:pPr>
+        <w:ind w:left="1440" w:hanging="360"/>
+      </w:pPr>
+      <w:rPr>
+        <w:rFonts w:ascii="Courier New" w:hAnsi="Courier New" w:cs="Courier New" w:hint="default"/>
+      </w:rPr>
+    </w:lvl>
+    <w:lvl w:ilvl="2" w:tplc="040C0005" w:tentative="1">
+      <w:start w:val="1"/>
+      <w:numFmt w:val="bullet"/>
+      <w:lvlText w:val=""/>
+      <w:lvlJc w:val="left"/>
+      <w:pPr>
+        <w:ind w:left="2160" w:hanging="360"/>
+      </w:pPr>
+      <w:rPr>
+        <w:rFonts w:ascii="Wingdings" w:hAnsi="Wingdings" w:hint="default"/>
+      </w:rPr>
+    </w:lvl>
+    <w:lvl w:ilvl="3" w:tplc="040C0001" w:tentative="1">
+      <w:start w:val="1"/>
+      <w:numFmt w:val="bullet"/>
+      <w:lvlText w:val=""/>
+      <w:lvlJc w:val="left"/>
+      <w:pPr>
+        <w:ind w:left="2880" w:hanging="360"/>
+      </w:pPr>
+      <w:rPr>
+        <w:rFonts w:ascii="Symbol" w:hAnsi="Symbol" w:hint="default"/>
+      </w:rPr>
+    </w:lvl>
+    <w:lvl w:ilvl="4" w:tplc="040C0003" w:tentative="1">
+      <w:start w:val="1"/>
+      <w:numFmt w:val="bullet"/>
+      <w:lvlText w:val="o"/>
+      <w:lvlJc w:val="left"/>
+      <w:pPr>
+        <w:ind w:left="3600" w:hanging="360"/>
+      </w:pPr>
+      <w:rPr>
+        <w:rFonts w:ascii="Courier New" w:hAnsi="Courier New" w:cs="Courier New" w:hint="default"/>
+      </w:rPr>
+    </w:lvl>
+    <w:lvl w:ilvl="5" w:tplc="040C0005" w:tentative="1">
+      <w:start w:val="1"/>
+      <w:numFmt w:val="bullet"/>
+      <w:lvlText w:val=""/>
+      <w:lvlJc w:val="left"/>
+      <w:pPr>
+        <w:ind w:left="4320" w:hanging="360"/>
+      </w:pPr>
+      <w:rPr>
+        <w:rFonts w:ascii="Wingdings" w:hAnsi="Wingdings" w:hint="default"/>
+      </w:rPr>
+    </w:lvl>
+    <w:lvl w:ilvl="6" w:tplc="040C0001" w:tentative="1">
+      <w:start w:val="1"/>
+      <w:numFmt w:val="bullet"/>
+      <w:lvlText w:val=""/>
+      <w:lvlJc w:val="left"/>
+      <w:pPr>
+        <w:ind w:left="5040" w:hanging="360"/>
+      </w:pPr>
+      <w:rPr>
+        <w:rFonts w:ascii="Symbol" w:hAnsi="Symbol" w:hint="default"/>
+      </w:rPr>
+    </w:lvl>
+    <w:lvl w:ilvl="7" w:tplc="040C0003" w:tentative="1">
+      <w:start w:val="1"/>
+      <w:numFmt w:val="bullet"/>
+      <w:lvlText w:val="o"/>
+      <w:lvlJc w:val="left"/>
+      <w:pPr>
+        <w:ind w:left="5760" w:hanging="360"/>
+      </w:pPr>
+      <w:rPr>
+        <w:rFonts w:ascii="Courier New" w:hAnsi="Courier New" w:cs="Courier New" w:hint="default"/>
+      </w:rPr>
+    </w:lvl>
+    <w:lvl w:ilvl="8" w:tplc="040C0005" w:tentative="1">
+      <w:start w:val="1"/>
+      <w:numFmt w:val="bullet"/>
+      <w:lvlText w:val=""/>
+      <w:lvlJc w:val="left"/>
+      <w:pPr>
+        <w:ind w:left="6480" w:hanging="360"/>
+      </w:pPr>
+      <w:rPr>
+        <w:rFonts w:ascii="Wingdings" w:hAnsi="Wingdings" w:hint="default"/>
+      </w:rPr>
+    </w:lvl>
+  </w:abstractNum>
+  <w:abstractNum w:abstractNumId="4" w15:restartNumberingAfterBreak="0">
     <w:nsid w:val="0D720347"/>
     <w:multiLevelType w:val="multilevel"/>
     <w:tmpl w:val="B8320F04"/>
@@ -4149,7 +4326,7 @@
       </w:rPr>
     </w:lvl>
   </w:abstractNum>
-  <w:abstractNum w:abstractNumId="4" w15:restartNumberingAfterBreak="0">
+  <w:abstractNum w:abstractNumId="5" w15:restartNumberingAfterBreak="0">
     <w:nsid w:val="0E42338A"/>
     <w:multiLevelType w:val="hybridMultilevel"/>
     <w:tmpl w:val="731C9ABE"/>
@@ -4235,7 +4412,7 @@
       </w:pPr>
     </w:lvl>
   </w:abstractNum>
-  <w:abstractNum w:abstractNumId="5" w15:restartNumberingAfterBreak="0">
+  <w:abstractNum w:abstractNumId="6" w15:restartNumberingAfterBreak="0">
     <w:nsid w:val="0F8B79A1"/>
     <w:multiLevelType w:val="multilevel"/>
     <w:tmpl w:val="E74CF2F4"/>
@@ -4384,7 +4561,7 @@
       </w:rPr>
     </w:lvl>
   </w:abstractNum>
-  <w:abstractNum w:abstractNumId="6" w15:restartNumberingAfterBreak="0">
+  <w:abstractNum w:abstractNumId="7" w15:restartNumberingAfterBreak="0">
     <w:nsid w:val="11F22916"/>
     <w:multiLevelType w:val="multilevel"/>
     <w:tmpl w:val="DA1AAA30"/>
@@ -4533,7 +4710,7 @@
       </w:rPr>
     </w:lvl>
   </w:abstractNum>
-  <w:abstractNum w:abstractNumId="7" w15:restartNumberingAfterBreak="0">
+  <w:abstractNum w:abstractNumId="8" w15:restartNumberingAfterBreak="0">
     <w:nsid w:val="198A6AAA"/>
     <w:multiLevelType w:val="multilevel"/>
     <w:tmpl w:val="B70E3AA8"/>
@@ -4682,7 +4859,7 @@
       </w:rPr>
     </w:lvl>
   </w:abstractNum>
-  <w:abstractNum w:abstractNumId="8" w15:restartNumberingAfterBreak="0">
+  <w:abstractNum w:abstractNumId="9" w15:restartNumberingAfterBreak="0">
     <w:nsid w:val="1E3212FD"/>
     <w:multiLevelType w:val="multilevel"/>
     <w:tmpl w:val="B8F405D6"/>
@@ -4798,7 +4975,7 @@
       </w:pPr>
     </w:lvl>
   </w:abstractNum>
-  <w:abstractNum w:abstractNumId="9" w15:restartNumberingAfterBreak="0">
+  <w:abstractNum w:abstractNumId="10" w15:restartNumberingAfterBreak="0">
     <w:nsid w:val="2F591A43"/>
     <w:multiLevelType w:val="hybridMultilevel"/>
     <w:tmpl w:val="731C9ABE"/>
@@ -4884,7 +5061,7 @@
       </w:pPr>
     </w:lvl>
   </w:abstractNum>
-  <w:abstractNum w:abstractNumId="10" w15:restartNumberingAfterBreak="0">
+  <w:abstractNum w:abstractNumId="11" w15:restartNumberingAfterBreak="0">
     <w:nsid w:val="37364D51"/>
     <w:multiLevelType w:val="multilevel"/>
     <w:tmpl w:val="B2201BF0"/>
@@ -5029,7 +5206,7 @@
       </w:rPr>
     </w:lvl>
   </w:abstractNum>
-  <w:abstractNum w:abstractNumId="11" w15:restartNumberingAfterBreak="0">
+  <w:abstractNum w:abstractNumId="12" w15:restartNumberingAfterBreak="0">
     <w:nsid w:val="3F4D1F6E"/>
     <w:multiLevelType w:val="multilevel"/>
     <w:tmpl w:val="FE72E9B6"/>
@@ -5174,7 +5351,7 @@
       </w:rPr>
     </w:lvl>
   </w:abstractNum>
-  <w:abstractNum w:abstractNumId="12" w15:restartNumberingAfterBreak="0">
+  <w:abstractNum w:abstractNumId="13" w15:restartNumberingAfterBreak="0">
     <w:nsid w:val="45005675"/>
     <w:multiLevelType w:val="multilevel"/>
     <w:tmpl w:val="1640DBA4"/>
@@ -5319,7 +5496,7 @@
       </w:rPr>
     </w:lvl>
   </w:abstractNum>
-  <w:abstractNum w:abstractNumId="13" w15:restartNumberingAfterBreak="0">
+  <w:abstractNum w:abstractNumId="14" w15:restartNumberingAfterBreak="0">
     <w:nsid w:val="54883176"/>
     <w:multiLevelType w:val="multilevel"/>
     <w:tmpl w:val="93D01220"/>
@@ -5468,7 +5645,7 @@
       </w:rPr>
     </w:lvl>
   </w:abstractNum>
-  <w:abstractNum w:abstractNumId="14" w15:restartNumberingAfterBreak="0">
+  <w:abstractNum w:abstractNumId="15" w15:restartNumberingAfterBreak="0">
     <w:nsid w:val="56054D89"/>
     <w:multiLevelType w:val="multilevel"/>
     <w:tmpl w:val="83DCEF78"/>
@@ -5617,7 +5794,7 @@
       </w:rPr>
     </w:lvl>
   </w:abstractNum>
-  <w:abstractNum w:abstractNumId="15" w15:restartNumberingAfterBreak="0">
+  <w:abstractNum w:abstractNumId="16" w15:restartNumberingAfterBreak="0">
     <w:nsid w:val="564E2D81"/>
     <w:multiLevelType w:val="hybridMultilevel"/>
     <w:tmpl w:val="CFFA1FCA"/>
@@ -5703,7 +5880,7 @@
       </w:pPr>
     </w:lvl>
   </w:abstractNum>
-  <w:abstractNum w:abstractNumId="16" w15:restartNumberingAfterBreak="0">
+  <w:abstractNum w:abstractNumId="17" w15:restartNumberingAfterBreak="0">
     <w:nsid w:val="58A91205"/>
     <w:multiLevelType w:val="multilevel"/>
     <w:tmpl w:val="E18C4BE4"/>
@@ -5852,7 +6029,7 @@
       </w:rPr>
     </w:lvl>
   </w:abstractNum>
-  <w:abstractNum w:abstractNumId="17" w15:restartNumberingAfterBreak="0">
+  <w:abstractNum w:abstractNumId="18" w15:restartNumberingAfterBreak="0">
     <w:nsid w:val="5DFD0627"/>
     <w:multiLevelType w:val="multilevel"/>
     <w:tmpl w:val="4626B2DC"/>
@@ -6001,7 +6178,7 @@
       </w:rPr>
     </w:lvl>
   </w:abstractNum>
-  <w:abstractNum w:abstractNumId="18" w15:restartNumberingAfterBreak="0">
+  <w:abstractNum w:abstractNumId="19" w15:restartNumberingAfterBreak="0">
     <w:nsid w:val="65E13772"/>
     <w:multiLevelType w:val="multilevel"/>
     <w:tmpl w:val="AF1A0A04"/>
@@ -6150,7 +6327,7 @@
       </w:rPr>
     </w:lvl>
   </w:abstractNum>
-  <w:abstractNum w:abstractNumId="19" w15:restartNumberingAfterBreak="0">
+  <w:abstractNum w:abstractNumId="20" w15:restartNumberingAfterBreak="0">
     <w:nsid w:val="68A127A8"/>
     <w:multiLevelType w:val="multilevel"/>
     <w:tmpl w:val="2BBAEDD8"/>
@@ -6263,7 +6440,7 @@
       </w:pPr>
     </w:lvl>
   </w:abstractNum>
-  <w:abstractNum w:abstractNumId="20" w15:restartNumberingAfterBreak="0">
+  <w:abstractNum w:abstractNumId="21" w15:restartNumberingAfterBreak="0">
     <w:nsid w:val="68B07B50"/>
     <w:multiLevelType w:val="multilevel"/>
     <w:tmpl w:val="E25ED6E8"/>
@@ -6408,7 +6585,7 @@
       </w:rPr>
     </w:lvl>
   </w:abstractNum>
-  <w:abstractNum w:abstractNumId="21" w15:restartNumberingAfterBreak="0">
+  <w:abstractNum w:abstractNumId="22" w15:restartNumberingAfterBreak="0">
     <w:nsid w:val="6E156FB4"/>
     <w:multiLevelType w:val="multilevel"/>
     <w:tmpl w:val="33B4FAD2"/>
@@ -6557,7 +6734,7 @@
       </w:rPr>
     </w:lvl>
   </w:abstractNum>
-  <w:abstractNum w:abstractNumId="22" w15:restartNumberingAfterBreak="0">
+  <w:abstractNum w:abstractNumId="23" w15:restartNumberingAfterBreak="0">
     <w:nsid w:val="71436E90"/>
     <w:multiLevelType w:val="multilevel"/>
     <w:tmpl w:val="C24C824A"/>
@@ -6670,7 +6847,7 @@
       </w:pPr>
     </w:lvl>
   </w:abstractNum>
-  <w:abstractNum w:abstractNumId="23" w15:restartNumberingAfterBreak="0">
+  <w:abstractNum w:abstractNumId="24" w15:restartNumberingAfterBreak="0">
     <w:nsid w:val="72003DFB"/>
     <w:multiLevelType w:val="multilevel"/>
     <w:tmpl w:val="1D103B7A"/>
@@ -6819,7 +6996,7 @@
       </w:rPr>
     </w:lvl>
   </w:abstractNum>
-  <w:abstractNum w:abstractNumId="24" w15:restartNumberingAfterBreak="0">
+  <w:abstractNum w:abstractNumId="25" w15:restartNumberingAfterBreak="0">
     <w:nsid w:val="743B58EB"/>
     <w:multiLevelType w:val="multilevel"/>
     <w:tmpl w:val="F46C7964"/>
@@ -6968,7 +7145,7 @@
       </w:rPr>
     </w:lvl>
   </w:abstractNum>
-  <w:abstractNum w:abstractNumId="25" w15:restartNumberingAfterBreak="0">
+  <w:abstractNum w:abstractNumId="26" w15:restartNumberingAfterBreak="0">
     <w:nsid w:val="749301ED"/>
     <w:multiLevelType w:val="hybridMultilevel"/>
     <w:tmpl w:val="58FC4CA6"/>
@@ -7058,82 +7235,85 @@
     </w:lvl>
   </w:abstractNum>
   <w:num w:numId="1" w16cid:durableId="1441340094">
-    <w:abstractNumId w:val="13"/>
+    <w:abstractNumId w:val="14"/>
   </w:num>
   <w:num w:numId="2" w16cid:durableId="1303123695">
-    <w:abstractNumId w:val="7"/>
+    <w:abstractNumId w:val="8"/>
   </w:num>
   <w:num w:numId="3" w16cid:durableId="1026828635">
-    <w:abstractNumId w:val="3"/>
+    <w:abstractNumId w:val="4"/>
   </w:num>
   <w:num w:numId="4" w16cid:durableId="1786994686">
-    <w:abstractNumId w:val="22"/>
+    <w:abstractNumId w:val="23"/>
   </w:num>
   <w:num w:numId="5" w16cid:durableId="2060544868">
-    <w:abstractNumId w:val="19"/>
+    <w:abstractNumId w:val="20"/>
   </w:num>
   <w:num w:numId="6" w16cid:durableId="563217560">
-    <w:abstractNumId w:val="5"/>
+    <w:abstractNumId w:val="6"/>
   </w:num>
   <w:num w:numId="7" w16cid:durableId="430244529">
-    <w:abstractNumId w:val="8"/>
+    <w:abstractNumId w:val="9"/>
   </w:num>
   <w:num w:numId="8" w16cid:durableId="957490105">
     <w:abstractNumId w:val="2"/>
   </w:num>
   <w:num w:numId="9" w16cid:durableId="1404135792">
-    <w:abstractNumId w:val="9"/>
+    <w:abstractNumId w:val="10"/>
   </w:num>
   <w:num w:numId="10" w16cid:durableId="1799449904">
-    <w:abstractNumId w:val="4"/>
+    <w:abstractNumId w:val="5"/>
   </w:num>
   <w:num w:numId="11" w16cid:durableId="1803645088">
-    <w:abstractNumId w:val="15"/>
+    <w:abstractNumId w:val="16"/>
   </w:num>
   <w:num w:numId="12" w16cid:durableId="1690524091">
-    <w:abstractNumId w:val="25"/>
+    <w:abstractNumId w:val="26"/>
   </w:num>
   <w:num w:numId="13" w16cid:durableId="2057510817">
     <w:abstractNumId w:val="0"/>
   </w:num>
   <w:num w:numId="14" w16cid:durableId="1518813204">
+    <w:abstractNumId w:val="13"/>
+  </w:num>
+  <w:num w:numId="15" w16cid:durableId="823349978">
+    <w:abstractNumId w:val="25"/>
+  </w:num>
+  <w:num w:numId="16" w16cid:durableId="1113592895">
     <w:abstractNumId w:val="12"/>
   </w:num>
-  <w:num w:numId="15" w16cid:durableId="823349978">
+  <w:num w:numId="17" w16cid:durableId="1147940976">
+    <w:abstractNumId w:val="15"/>
+  </w:num>
+  <w:num w:numId="18" w16cid:durableId="1095442807">
+    <w:abstractNumId w:val="19"/>
+  </w:num>
+  <w:num w:numId="19" w16cid:durableId="1229002789">
+    <w:abstractNumId w:val="7"/>
+  </w:num>
+  <w:num w:numId="20" w16cid:durableId="464273381">
     <w:abstractNumId w:val="24"/>
   </w:num>
-  <w:num w:numId="16" w16cid:durableId="1113592895">
-    <w:abstractNumId w:val="11"/>
-  </w:num>
-  <w:num w:numId="17" w16cid:durableId="1147940976">
-    <w:abstractNumId w:val="14"/>
-  </w:num>
-  <w:num w:numId="18" w16cid:durableId="1095442807">
-    <w:abstractNumId w:val="18"/>
-  </w:num>
-  <w:num w:numId="19" w16cid:durableId="1229002789">
-    <w:abstractNumId w:val="6"/>
-  </w:num>
-  <w:num w:numId="20" w16cid:durableId="464273381">
-    <w:abstractNumId w:val="23"/>
-  </w:num>
   <w:num w:numId="21" w16cid:durableId="2110808300">
-    <w:abstractNumId w:val="21"/>
+    <w:abstractNumId w:val="22"/>
   </w:num>
   <w:num w:numId="22" w16cid:durableId="16515952">
     <w:abstractNumId w:val="1"/>
   </w:num>
   <w:num w:numId="23" w16cid:durableId="259266198">
+    <w:abstractNumId w:val="18"/>
+  </w:num>
+  <w:num w:numId="24" w16cid:durableId="278338733">
+    <w:abstractNumId w:val="11"/>
+  </w:num>
+  <w:num w:numId="25" w16cid:durableId="1609316925">
     <w:abstractNumId w:val="17"/>
   </w:num>
-  <w:num w:numId="24" w16cid:durableId="278338733">
-    <w:abstractNumId w:val="10"/>
+  <w:num w:numId="26" w16cid:durableId="113135451">
+    <w:abstractNumId w:val="21"/>
   </w:num>
-  <w:num w:numId="25" w16cid:durableId="1609316925">
-    <w:abstractNumId w:val="16"/>
-  </w:num>
-  <w:num w:numId="26" w16cid:durableId="113135451">
-    <w:abstractNumId w:val="20"/>
+  <w:num w:numId="27" w16cid:durableId="435563999">
+    <w:abstractNumId w:val="3"/>
   </w:num>
 </w:numbering>
 </file>

</xml_diff>

<commit_message>
Finalisation de l'asset PDF sur l'Aigle
</commit_message>
<xml_diff>
--- a/assets/Terre-de-Barons-TB7-Eagle-Crest-Lyrics.docx
+++ b/assets/Terre-de-Barons-TB7-Eagle-Crest-Lyrics.docx
@@ -8,6 +8,86 @@
       </w:pPr>
       <w:r>
         <w:rPr>
+          <w:noProof/>
+        </w:rPr>
+        <w:drawing>
+          <wp:anchor distT="0" distB="0" distL="114300" distR="114300" simplePos="0" relativeHeight="251658240" behindDoc="1" locked="0" layoutInCell="1" allowOverlap="1" wp14:anchorId="3F32D845" wp14:editId="2CF28681">
+            <wp:simplePos x="0" y="0"/>
+            <wp:positionH relativeFrom="margin">
+              <wp:posOffset>23495</wp:posOffset>
+            </wp:positionH>
+            <wp:positionV relativeFrom="paragraph">
+              <wp:posOffset>3175</wp:posOffset>
+            </wp:positionV>
+            <wp:extent cx="1432560" cy="1728470"/>
+            <wp:effectExtent l="0" t="0" r="0" b="5080"/>
+            <wp:wrapTight wrapText="bothSides">
+              <wp:wrapPolygon edited="0">
+                <wp:start x="0" y="0"/>
+                <wp:lineTo x="0" y="21425"/>
+                <wp:lineTo x="21255" y="21425"/>
+                <wp:lineTo x="21255" y="0"/>
+                <wp:lineTo x="0" y="0"/>
+              </wp:wrapPolygon>
+            </wp:wrapTight>
+            <wp:docPr id="523175609" name="Image 1"/>
+            <wp:cNvGraphicFramePr>
+              <a:graphicFrameLocks xmlns:a="http://schemas.openxmlformats.org/drawingml/2006/main" noChangeAspect="1"/>
+            </wp:cNvGraphicFramePr>
+            <a:graphic xmlns:a="http://schemas.openxmlformats.org/drawingml/2006/main">
+              <a:graphicData uri="http://schemas.openxmlformats.org/drawingml/2006/picture">
+                <pic:pic xmlns:pic="http://schemas.openxmlformats.org/drawingml/2006/picture">
+                  <pic:nvPicPr>
+                    <pic:cNvPr id="0" name="Picture 1"/>
+                    <pic:cNvPicPr>
+                      <a:picLocks noChangeAspect="1" noChangeArrowheads="1"/>
+                    </pic:cNvPicPr>
+                  </pic:nvPicPr>
+                  <pic:blipFill rotWithShape="1">
+                    <a:blip r:embed="rId7" cstate="print">
+                      <a:extLst>
+                        <a:ext uri="{28A0092B-C50C-407E-A947-70E740481C1C}">
+                          <a14:useLocalDpi xmlns:a14="http://schemas.microsoft.com/office/drawing/2010/main" val="0"/>
+                        </a:ext>
+                      </a:extLst>
+                    </a:blip>
+                    <a:srcRect l="63378" t="33499" r="8647" b="4486"/>
+                    <a:stretch>
+                      <a:fillRect/>
+                    </a:stretch>
+                  </pic:blipFill>
+                  <pic:spPr bwMode="auto">
+                    <a:xfrm>
+                      <a:off x="0" y="0"/>
+                      <a:ext cx="1432560" cy="1728470"/>
+                    </a:xfrm>
+                    <a:prstGeom prst="rect">
+                      <a:avLst/>
+                    </a:prstGeom>
+                    <a:noFill/>
+                    <a:ln>
+                      <a:noFill/>
+                    </a:ln>
+                    <a:extLst>
+                      <a:ext uri="{53640926-AAD7-44D8-BBD7-CCE9431645EC}">
+                        <a14:shadowObscured xmlns:a14="http://schemas.microsoft.com/office/drawing/2010/main"/>
+                      </a:ext>
+                    </a:extLst>
+                  </pic:spPr>
+                </pic:pic>
+              </a:graphicData>
+            </a:graphic>
+            <wp14:sizeRelH relativeFrom="margin">
+              <wp14:pctWidth>0</wp14:pctWidth>
+            </wp14:sizeRelH>
+            <wp14:sizeRelV relativeFrom="margin">
+              <wp14:pctHeight>0</wp14:pctHeight>
+            </wp14:sizeRelV>
+          </wp:anchor>
+        </w:drawing>
+      </w:r>
+      <w:r>
+        <w:rPr>
           <w:b/>
           <w:bCs/>
         </w:rPr>
@@ -36,35 +116,13 @@
           <w:bCs/>
           <w:lang w:val="en-US"/>
         </w:rPr>
-        <w:t xml:space="preserve">Note on the Song's </w:t>
-      </w:r>
-      <w:proofErr w:type="gramStart"/>
-      <w:r>
-        <w:rPr>
-          <w:b/>
-          <w:bCs/>
-          <w:lang w:val="en-US"/>
-        </w:rPr>
-        <w:t>Language</w:t>
-      </w:r>
-      <w:r>
-        <w:rPr>
-          <w:lang w:val="en-US"/>
-        </w:rPr>
-        <w:t xml:space="preserve">  –</w:t>
-      </w:r>
-      <w:proofErr w:type="gramEnd"/>
-      <w:r>
-        <w:rPr>
-          <w:lang w:val="en-US"/>
-        </w:rPr>
-        <w:t xml:space="preserve"> </w:t>
-      </w:r>
-      <w:r>
-        <w:rPr>
-          <w:lang w:val="en-US"/>
-        </w:rPr>
-        <w:t>The lyrics of this hymn are performed in a hybrid archaic Occitan, generated by artificial intelligence. Details regarding the peculiarities of this seigneurial lexicon and its linguistic anomalies are explained at the end of this document, after the lyrics.</w:t>
+        <w:t>Note on the Song's Language</w:t>
+      </w:r>
+      <w:r>
+        <w:rPr>
+          <w:lang w:val="en-US"/>
+        </w:rPr>
+        <w:t xml:space="preserve"> – The lyrics of this hymn are performed in a hybrid archaic Occitan, generated by artificial intelligence. Details regarding the peculiarities of this seigneurial lexicon and its linguistic anomalies are explained at the end of this document, after the lyrics.</w:t>
       </w:r>
     </w:p>
     <w:p>
@@ -170,9 +228,9 @@
         <w:tblLook w:val="04A0" w:firstRow="1" w:lastRow="0" w:firstColumn="1" w:lastColumn="0" w:noHBand="0" w:noVBand="1"/>
       </w:tblPr>
       <w:tblGrid>
-        <w:gridCol w:w="3020"/>
-        <w:gridCol w:w="3021"/>
-        <w:gridCol w:w="3021"/>
+        <w:gridCol w:w="3208"/>
+        <w:gridCol w:w="3210"/>
+        <w:gridCol w:w="3210"/>
       </w:tblGrid>
       <w:tr>
         <w:tc>
@@ -533,9 +591,9 @@
         <w:tblLook w:val="04A0" w:firstRow="1" w:lastRow="0" w:firstColumn="1" w:lastColumn="0" w:noHBand="0" w:noVBand="1"/>
       </w:tblPr>
       <w:tblGrid>
-        <w:gridCol w:w="3020"/>
-        <w:gridCol w:w="3021"/>
-        <w:gridCol w:w="3021"/>
+        <w:gridCol w:w="3208"/>
+        <w:gridCol w:w="3210"/>
+        <w:gridCol w:w="3210"/>
       </w:tblGrid>
       <w:tr>
         <w:tc>
@@ -948,9 +1006,9 @@
         <w:tblLook w:val="04A0" w:firstRow="1" w:lastRow="0" w:firstColumn="1" w:lastColumn="0" w:noHBand="0" w:noVBand="1"/>
       </w:tblPr>
       <w:tblGrid>
-        <w:gridCol w:w="3020"/>
-        <w:gridCol w:w="3021"/>
-        <w:gridCol w:w="3021"/>
+        <w:gridCol w:w="3208"/>
+        <w:gridCol w:w="3210"/>
+        <w:gridCol w:w="3210"/>
       </w:tblGrid>
       <w:tr>
         <w:tc>
@@ -1326,9 +1384,9 @@
         <w:tblLook w:val="04A0" w:firstRow="1" w:lastRow="0" w:firstColumn="1" w:lastColumn="0" w:noHBand="0" w:noVBand="1"/>
       </w:tblPr>
       <w:tblGrid>
-        <w:gridCol w:w="3020"/>
-        <w:gridCol w:w="3021"/>
-        <w:gridCol w:w="3021"/>
+        <w:gridCol w:w="3208"/>
+        <w:gridCol w:w="3210"/>
+        <w:gridCol w:w="3210"/>
       </w:tblGrid>
       <w:tr>
         <w:tc>
@@ -1715,9 +1773,9 @@
         <w:tblLook w:val="04A0" w:firstRow="1" w:lastRow="0" w:firstColumn="1" w:lastColumn="0" w:noHBand="0" w:noVBand="1"/>
       </w:tblPr>
       <w:tblGrid>
-        <w:gridCol w:w="3020"/>
-        <w:gridCol w:w="3021"/>
-        <w:gridCol w:w="3021"/>
+        <w:gridCol w:w="3208"/>
+        <w:gridCol w:w="3210"/>
+        <w:gridCol w:w="3210"/>
       </w:tblGrid>
       <w:tr>
         <w:tc>
@@ -2055,14 +2113,17 @@
         <w:tblLook w:val="04A0" w:firstRow="1" w:lastRow="0" w:firstColumn="1" w:lastColumn="0" w:noHBand="0" w:noVBand="1"/>
       </w:tblPr>
       <w:tblGrid>
-        <w:gridCol w:w="3020"/>
-        <w:gridCol w:w="3021"/>
-        <w:gridCol w:w="3021"/>
+        <w:gridCol w:w="3208"/>
+        <w:gridCol w:w="3212"/>
+        <w:gridCol w:w="3208"/>
       </w:tblGrid>
       <w:tr>
         <w:tc>
           <w:tcPr>
             <w:tcW w:w="1666" w:type="pct"/>
+            <w:tcBorders>
+              <w:bottom w:val="single" w:sz="4" w:space="0" w:color="auto"/>
+            </w:tcBorders>
             <w:shd w:val="clear" w:color="auto" w:fill="BFBFBF" w:themeFill="background1" w:themeFillShade="BF"/>
           </w:tcPr>
           <w:p>
@@ -2084,7 +2145,10 @@
         </w:tc>
         <w:tc>
           <w:tcPr>
-            <w:tcW w:w="1667" w:type="pct"/>
+            <w:tcW w:w="1668" w:type="pct"/>
+            <w:tcBorders>
+              <w:bottom w:val="single" w:sz="4" w:space="0" w:color="auto"/>
+            </w:tcBorders>
             <w:shd w:val="clear" w:color="auto" w:fill="BFBFBF" w:themeFill="background1" w:themeFillShade="BF"/>
           </w:tcPr>
           <w:p>
@@ -2109,7 +2173,10 @@
         </w:tc>
         <w:tc>
           <w:tcPr>
-            <w:tcW w:w="1667" w:type="pct"/>
+            <w:tcW w:w="1666" w:type="pct"/>
+            <w:tcBorders>
+              <w:bottom w:val="single" w:sz="4" w:space="0" w:color="auto"/>
+            </w:tcBorders>
             <w:shd w:val="clear" w:color="auto" w:fill="BFBFBF" w:themeFill="background1" w:themeFillShade="BF"/>
           </w:tcPr>
           <w:p>
@@ -2156,7 +2223,7 @@
         </w:tc>
         <w:tc>
           <w:tcPr>
-            <w:tcW w:w="1667" w:type="pct"/>
+            <w:tcW w:w="1668" w:type="pct"/>
             <w:vAlign w:val="center"/>
           </w:tcPr>
           <w:p>
@@ -2167,7 +2234,7 @@
         </w:tc>
         <w:tc>
           <w:tcPr>
-            <w:tcW w:w="1667" w:type="pct"/>
+            <w:tcW w:w="1666" w:type="pct"/>
             <w:vAlign w:val="center"/>
           </w:tcPr>
           <w:p>
@@ -2192,6 +2259,9 @@
         <w:tc>
           <w:tcPr>
             <w:tcW w:w="1666" w:type="pct"/>
+            <w:tcBorders>
+              <w:bottom w:val="single" w:sz="4" w:space="0" w:color="auto"/>
+            </w:tcBorders>
             <w:vAlign w:val="center"/>
           </w:tcPr>
           <w:p>
@@ -2214,7 +2284,10 @@
         </w:tc>
         <w:tc>
           <w:tcPr>
-            <w:tcW w:w="1667" w:type="pct"/>
+            <w:tcW w:w="1668" w:type="pct"/>
+            <w:tcBorders>
+              <w:bottom w:val="single" w:sz="4" w:space="0" w:color="auto"/>
+            </w:tcBorders>
             <w:vAlign w:val="center"/>
           </w:tcPr>
           <w:p>
@@ -2225,7 +2298,10 @@
         </w:tc>
         <w:tc>
           <w:tcPr>
-            <w:tcW w:w="1667" w:type="pct"/>
+            <w:tcW w:w="1666" w:type="pct"/>
+            <w:tcBorders>
+              <w:bottom w:val="single" w:sz="4" w:space="0" w:color="auto"/>
+            </w:tcBorders>
             <w:vAlign w:val="center"/>
           </w:tcPr>
           <w:p>
@@ -2405,6 +2481,70 @@
     </w:p>
     <w:p>
       <w:pPr>
+        <w:ind w:left="360"/>
+        <w:jc w:val="center"/>
+      </w:pPr>
+      <w:r>
+        <w:rPr>
+          <w:noProof/>
+        </w:rPr>
+        <w:drawing>
+          <wp:inline distT="0" distB="0" distL="0" distR="0" wp14:anchorId="02180B02" wp14:editId="1B2D202F">
+            <wp:extent cx="3312479" cy="1188000"/>
+            <wp:effectExtent l="0" t="0" r="2540" b="0"/>
+            <wp:docPr id="1098072831" name="Image 4"/>
+            <wp:cNvGraphicFramePr>
+              <a:graphicFrameLocks xmlns:a="http://schemas.openxmlformats.org/drawingml/2006/main" noChangeAspect="1"/>
+            </wp:cNvGraphicFramePr>
+            <a:graphic xmlns:a="http://schemas.openxmlformats.org/drawingml/2006/main">
+              <a:graphicData uri="http://schemas.openxmlformats.org/drawingml/2006/picture">
+                <pic:pic xmlns:pic="http://schemas.openxmlformats.org/drawingml/2006/picture">
+                  <pic:nvPicPr>
+                    <pic:cNvPr id="0" name="Picture 7"/>
+                    <pic:cNvPicPr>
+                      <a:picLocks noChangeAspect="1" noChangeArrowheads="1"/>
+                    </pic:cNvPicPr>
+                  </pic:nvPicPr>
+                  <pic:blipFill rotWithShape="1">
+                    <a:blip r:embed="rId8" cstate="print">
+                      <a:extLst>
+                        <a:ext uri="{28A0092B-C50C-407E-A947-70E740481C1C}">
+                          <a14:useLocalDpi xmlns:a14="http://schemas.microsoft.com/office/drawing/2010/main" val="0"/>
+                        </a:ext>
+                      </a:extLst>
+                    </a:blip>
+                    <a:srcRect t="10967" b="23217"/>
+                    <a:stretch>
+                      <a:fillRect/>
+                    </a:stretch>
+                  </pic:blipFill>
+                  <pic:spPr bwMode="auto">
+                    <a:xfrm>
+                      <a:off x="0" y="0"/>
+                      <a:ext cx="3312479" cy="1188000"/>
+                    </a:xfrm>
+                    <a:prstGeom prst="rect">
+                      <a:avLst/>
+                    </a:prstGeom>
+                    <a:noFill/>
+                    <a:ln>
+                      <a:noFill/>
+                    </a:ln>
+                    <a:extLst>
+                      <a:ext uri="{53640926-AAD7-44D8-BBD7-CCE9431645EC}">
+                        <a14:shadowObscured xmlns:a14="http://schemas.microsoft.com/office/drawing/2010/main"/>
+                      </a:ext>
+                    </a:extLst>
+                  </pic:spPr>
+                </pic:pic>
+              </a:graphicData>
+            </a:graphic>
+          </wp:inline>
+        </w:drawing>
+      </w:r>
+    </w:p>
+    <w:p>
+      <w:pPr>
         <w:pStyle w:val="Titre2"/>
         <w:jc w:val="both"/>
       </w:pPr>
@@ -2811,6 +2951,86 @@
       </w:pPr>
       <w:r>
         <w:rPr>
+          <w:noProof/>
+        </w:rPr>
+        <w:drawing>
+          <wp:anchor distT="0" distB="0" distL="114300" distR="114300" simplePos="0" relativeHeight="251659264" behindDoc="1" locked="0" layoutInCell="1" allowOverlap="1" wp14:anchorId="3192439B" wp14:editId="2A65B713">
+            <wp:simplePos x="0" y="0"/>
+            <wp:positionH relativeFrom="margin">
+              <wp:align>right</wp:align>
+            </wp:positionH>
+            <wp:positionV relativeFrom="paragraph">
+              <wp:posOffset>236220</wp:posOffset>
+            </wp:positionV>
+            <wp:extent cx="3310255" cy="1609725"/>
+            <wp:effectExtent l="0" t="0" r="4445" b="0"/>
+            <wp:wrapTight wrapText="bothSides">
+              <wp:wrapPolygon edited="0">
+                <wp:start x="0" y="0"/>
+                <wp:lineTo x="0" y="21217"/>
+                <wp:lineTo x="21505" y="21217"/>
+                <wp:lineTo x="21505" y="0"/>
+                <wp:lineTo x="0" y="0"/>
+              </wp:wrapPolygon>
+            </wp:wrapTight>
+            <wp:docPr id="2140339659" name="Image 4"/>
+            <wp:cNvGraphicFramePr>
+              <a:graphicFrameLocks xmlns:a="http://schemas.openxmlformats.org/drawingml/2006/main" noChangeAspect="1"/>
+            </wp:cNvGraphicFramePr>
+            <a:graphic xmlns:a="http://schemas.openxmlformats.org/drawingml/2006/main">
+              <a:graphicData uri="http://schemas.openxmlformats.org/drawingml/2006/picture">
+                <pic:pic xmlns:pic="http://schemas.openxmlformats.org/drawingml/2006/picture">
+                  <pic:nvPicPr>
+                    <pic:cNvPr id="0" name="Picture 7"/>
+                    <pic:cNvPicPr>
+                      <a:picLocks noChangeAspect="1" noChangeArrowheads="1"/>
+                    </pic:cNvPicPr>
+                  </pic:nvPicPr>
+                  <pic:blipFill rotWithShape="1">
+                    <a:blip r:embed="rId8" cstate="print">
+                      <a:extLst>
+                        <a:ext uri="{28A0092B-C50C-407E-A947-70E740481C1C}">
+                          <a14:useLocalDpi xmlns:a14="http://schemas.microsoft.com/office/drawing/2010/main" val="0"/>
+                        </a:ext>
+                      </a:extLst>
+                    </a:blip>
+                    <a:srcRect t="10968" b="-189"/>
+                    <a:stretch>
+                      <a:fillRect/>
+                    </a:stretch>
+                  </pic:blipFill>
+                  <pic:spPr bwMode="auto">
+                    <a:xfrm>
+                      <a:off x="0" y="0"/>
+                      <a:ext cx="3312000" cy="1610471"/>
+                    </a:xfrm>
+                    <a:prstGeom prst="rect">
+                      <a:avLst/>
+                    </a:prstGeom>
+                    <a:noFill/>
+                    <a:ln>
+                      <a:noFill/>
+                    </a:ln>
+                    <a:extLst>
+                      <a:ext uri="{53640926-AAD7-44D8-BBD7-CCE9431645EC}">
+                        <a14:shadowObscured xmlns:a14="http://schemas.microsoft.com/office/drawing/2010/main"/>
+                      </a:ext>
+                    </a:extLst>
+                  </pic:spPr>
+                </pic:pic>
+              </a:graphicData>
+            </a:graphic>
+            <wp14:sizeRelH relativeFrom="margin">
+              <wp14:pctWidth>0</wp14:pctWidth>
+            </wp14:sizeRelH>
+            <wp14:sizeRelV relativeFrom="margin">
+              <wp14:pctHeight>0</wp14:pctHeight>
+            </wp14:sizeRelV>
+          </wp:anchor>
+        </w:drawing>
+      </w:r>
+      <w:r>
+        <w:rPr>
           <w:lang w:val="en-US"/>
         </w:rPr>
         <w:t>The selected vocabulary perfectly conveys the harshness of the Eagle's domain and the solemnity of a knighting ceremony:</w:t>
@@ -2964,6 +3184,12 @@
     </w:p>
     <w:p>
       <w:pPr>
+        <w:ind w:left="360"/>
+        <w:jc w:val="center"/>
+      </w:pPr>
+    </w:p>
+    <w:p>
+      <w:pPr>
         <w:pStyle w:val="Titre2"/>
         <w:rPr>
           <w:lang w:val="en-US"/>
@@ -3467,9 +3693,9 @@
       </w:r>
     </w:p>
     <w:sectPr>
-      <w:headerReference w:type="default" r:id="rId7"/>
+      <w:headerReference w:type="default" r:id="rId9"/>
       <w:pgSz w:w="11906" w:h="16838"/>
-      <w:pgMar w:top="1417" w:right="1417" w:bottom="1417" w:left="1417" w:header="567" w:footer="0" w:gutter="0"/>
+      <w:pgMar w:top="1134" w:right="1134" w:bottom="1134" w:left="1134" w:header="567" w:footer="0" w:gutter="0"/>
       <w:cols w:space="708"/>
       <w:docGrid w:linePitch="360"/>
     </w:sectPr>
@@ -3532,6 +3758,7 @@
   <w:p>
     <w:pPr>
       <w:pStyle w:val="En-tte"/>
+      <w:jc w:val="both"/>
       <w:rPr>
         <w:sz w:val="16"/>
         <w:szCs w:val="16"/>
@@ -3543,13 +3770,6 @@
         <w:szCs w:val="16"/>
       </w:rPr>
       <w:t>Terre-de-Barons-TB7-Eagle-Crest-Lyrics</w:t>
-    </w:r>
-    <w:r>
-      <w:rPr>
-        <w:sz w:val="16"/>
-        <w:szCs w:val="16"/>
-      </w:rPr>
-      <w:tab/>
     </w:r>
     <w:r>
       <w:rPr>
@@ -7920,6 +8140,7 @@
   <w:style w:type="character" w:default="1" w:styleId="Policepardfaut">
     <w:name w:val="Default Paragraph Font"/>
     <w:uiPriority w:val="1"/>
+    <w:semiHidden/>
     <w:unhideWhenUsed/>
   </w:style>
   <w:style w:type="table" w:default="1" w:styleId="TableauNormal">

</xml_diff>